<commit_message>
Fix mongoose connectionstate error in docker
</commit_message>
<xml_diff>
--- a/SKKN - Tu Nguyen (Repaired).docx
+++ b/SKKN - Tu Nguyen (Repaired).docx
@@ -3636,7 +3636,6 @@
     </w:p>
     <w:tbl>
       <w:tblPr>
-        <w:tblStyle w:val="TOCHeading"/>
         <w:tblW w:w="8035" w:type="dxa"/>
         <w:tblInd w:w="245" w:type="dxa"/>
         <w:tblCellMar>
@@ -3669,35 +3668,30 @@
             </w:pPr>
             <w:r>
               <w:rPr>
-                <w:rFonts w:ascii="Times New Roman" w:eastAsia="Times New Roman" w:hAnsi="Times New Roman" w:cs="Times New Roman"/>
                 <w:b/>
               </w:rPr>
               <w:t xml:space="preserve">Ý kiến xác nhận của </w:t>
             </w:r>
             <w:r>
               <w:rPr>
-                <w:rFonts w:ascii="Times New Roman" w:eastAsia="Times New Roman" w:hAnsi="Times New Roman" w:cs="Times New Roman"/>
                 <w:b/>
               </w:rPr>
               <w:br/>
             </w:r>
             <w:r>
               <w:rPr>
-                <w:rFonts w:ascii="Times New Roman" w:eastAsia="Times New Roman" w:hAnsi="Times New Roman" w:cs="Times New Roman"/>
                 <w:b/>
               </w:rPr>
               <w:t xml:space="preserve">Thủ </w:t>
             </w:r>
             <w:r>
               <w:rPr>
-                <w:rFonts w:ascii="Times New Roman" w:eastAsia="Times New Roman" w:hAnsi="Times New Roman" w:cs="Times New Roman"/>
                 <w:b/>
               </w:rPr>
               <w:t>t</w:t>
             </w:r>
             <w:r>
               <w:rPr>
-                <w:rFonts w:ascii="Times New Roman" w:eastAsia="Times New Roman" w:hAnsi="Times New Roman" w:cs="Times New Roman"/>
                 <w:b/>
               </w:rPr>
               <w:t>rưởng đơn vị</w:t>
@@ -3722,7 +3716,6 @@
             </w:pPr>
             <w:r>
               <w:rPr>
-                <w:rFonts w:ascii="Times New Roman" w:eastAsia="Times New Roman" w:hAnsi="Times New Roman" w:cs="Times New Roman"/>
                 <w:i/>
               </w:rPr>
               <w:t>Ngày 08 tháng 4 năm 2026</w:t>
@@ -3735,7 +3728,6 @@
             </w:pPr>
             <w:r>
               <w:rPr>
-                <w:rFonts w:ascii="Times New Roman" w:eastAsia="Times New Roman" w:hAnsi="Times New Roman" w:cs="Times New Roman"/>
                 <w:b/>
               </w:rPr>
               <w:t xml:space="preserve">Đồng tác giả </w:t>
@@ -3893,6 +3885,7 @@
           <w:sz w:val="40"/>
           <w:szCs w:val="26"/>
         </w:rPr>
+        <w:lastRenderedPageBreak/>
         <w:t>MỞ ĐẦU</w:t>
       </w:r>
       <w:bookmarkEnd w:id="38"/>
@@ -9442,7 +9435,7 @@
           <w:szCs w:val="26"/>
         </w:rPr>
         <w:drawing>
-          <wp:anchor distT="0" distB="0" distL="114300" distR="114300" simplePos="0" relativeHeight="251676672" behindDoc="0" locked="0" layoutInCell="1" allowOverlap="1" wp14:anchorId="411F57AF" wp14:editId="33F96771">
+          <wp:anchor distT="0" distB="0" distL="114300" distR="114300" simplePos="0" relativeHeight="251676672" behindDoc="0" locked="0" layoutInCell="1" allowOverlap="1" wp14:anchorId="411F57AF" wp14:editId="046D4521">
             <wp:simplePos x="3929380" y="4721860"/>
             <wp:positionH relativeFrom="margin">
               <wp:align>right</wp:align>
@@ -9815,8 +9808,6 @@
         <w:jc w:val="both"/>
         <w:rPr>
           <w:noProof/>
-          <w:sz w:val="26"/>
-          <w:szCs w:val="26"/>
         </w:rPr>
       </w:pPr>
       <w:r>
@@ -9863,30 +9854,15 @@
           <w:bdr w:val="single" w:sz="4" w:space="0" w:color="auto"/>
         </w:rPr>
       </w:pPr>
-    </w:p>
-    <w:p>
-      <w:pPr>
-        <w:widowControl w:val="0"/>
-        <w:spacing w:before="120" w:after="120" w:line="312" w:lineRule="auto"/>
-        <w:ind w:left="270"/>
-        <w:jc w:val="center"/>
-        <w:rPr>
-          <w:noProof/>
-          <w:sz w:val="26"/>
-          <w:szCs w:val="26"/>
-        </w:rPr>
-      </w:pPr>
-      <w:r>
-        <w:rPr>
-          <w:noProof/>
-          <w:bdr w:val="single" w:sz="4" w:space="0" w:color="auto"/>
-        </w:rPr>
-        <w:lastRenderedPageBreak/>
+      <w:r>
+        <w:rPr>
+          <w:noProof/>
+        </w:rPr>
         <w:drawing>
-          <wp:inline distT="0" distB="0" distL="0" distR="0" wp14:anchorId="2475DA2E" wp14:editId="37D9A50D">
-            <wp:extent cx="5604137" cy="1651000"/>
-            <wp:effectExtent l="19050" t="19050" r="15875" b="25400"/>
-            <wp:docPr id="984467324" name="Picture 1"/>
+          <wp:inline distT="0" distB="0" distL="0" distR="0" wp14:anchorId="643CCB76" wp14:editId="0F7B99B1">
+            <wp:extent cx="5943600" cy="1207135"/>
+            <wp:effectExtent l="0" t="0" r="0" b="0"/>
+            <wp:docPr id="1391767594" name="Picture 1"/>
             <wp:cNvGraphicFramePr>
               <a:graphicFrameLocks xmlns:a="http://schemas.openxmlformats.org/drawingml/2006/main" noChangeAspect="1"/>
             </wp:cNvGraphicFramePr>
@@ -9894,12 +9870,12 @@
               <a:graphicData uri="http://schemas.openxmlformats.org/drawingml/2006/picture">
                 <pic:pic xmlns:pic="http://schemas.openxmlformats.org/drawingml/2006/picture">
                   <pic:nvPicPr>
-                    <pic:cNvPr id="984467324" name=""/>
+                    <pic:cNvPr id="1391767594" name=""/>
                     <pic:cNvPicPr/>
                   </pic:nvPicPr>
                   <pic:blipFill rotWithShape="1">
                     <a:blip r:embed="rId22"/>
-                    <a:srcRect b="47623"/>
+                    <a:srcRect t="57386"/>
                     <a:stretch>
                       <a:fillRect/>
                     </a:stretch>
@@ -9907,37 +9883,13 @@
                   <pic:spPr bwMode="auto">
                     <a:xfrm>
                       <a:off x="0" y="0"/>
-                      <a:ext cx="5614290" cy="1653991"/>
+                      <a:ext cx="5943600" cy="1207135"/>
                     </a:xfrm>
                     <a:prstGeom prst="rect">
                       <a:avLst/>
                     </a:prstGeom>
-                    <a:ln w="9525" cap="flat" cmpd="sng" algn="ctr">
-                      <a:solidFill>
-                        <a:sysClr val="windowText" lastClr="000000">
-                          <a:lumMod val="95000"/>
-                          <a:lumOff val="5000"/>
-                        </a:sysClr>
-                      </a:solidFill>
-                      <a:prstDash val="solid"/>
-                      <a:round/>
-                      <a:headEnd type="none" w="med" len="med"/>
-                      <a:tailEnd type="none" w="med" len="med"/>
-                      <a:extLst>
-                        <a:ext uri="{C807C97D-BFC1-408E-A445-0C87EB9F89A2}">
-                          <ask:lineSketchStyleProps xmlns:ask="http://schemas.microsoft.com/office/drawing/2018/sketchyshapes" sd="0">
-                            <a:custGeom>
-                              <a:avLst/>
-                              <a:gdLst/>
-                              <a:ahLst/>
-                              <a:cxnLst/>
-                              <a:rect l="0" t="0" r="0" b="0"/>
-                              <a:pathLst/>
-                            </a:custGeom>
-                            <ask:type/>
-                          </ask:lineSketchStyleProps>
-                        </a:ext>
-                      </a:extLst>
+                    <a:ln>
+                      <a:noFill/>
                     </a:ln>
                     <a:extLst>
                       <a:ext uri="{53640926-AAD7-44D8-BBD7-CCE9431645EC}">
@@ -9951,6 +9903,19 @@
           </wp:inline>
         </w:drawing>
       </w:r>
+    </w:p>
+    <w:p>
+      <w:pPr>
+        <w:widowControl w:val="0"/>
+        <w:spacing w:before="120" w:after="120" w:line="312" w:lineRule="auto"/>
+        <w:ind w:left="270"/>
+        <w:jc w:val="center"/>
+        <w:rPr>
+          <w:noProof/>
+          <w:sz w:val="26"/>
+          <w:szCs w:val="26"/>
+        </w:rPr>
+      </w:pPr>
       <w:r>
         <w:rPr>
           <w:b/>
@@ -9994,7 +9959,149 @@
       <w:pPr>
         <w:widowControl w:val="0"/>
         <w:spacing w:before="120" w:after="120" w:line="312" w:lineRule="auto"/>
+        <w:ind w:left="90"/>
+        <w:rPr>
+          <w:b/>
+          <w:bCs/>
+          <w:noProof/>
+          <w:sz w:val="26"/>
+          <w:szCs w:val="26"/>
+        </w:rPr>
+      </w:pPr>
+      <w:r>
+        <w:rPr>
+          <w:noProof/>
+        </w:rPr>
+        <w:lastRenderedPageBreak/>
+        <w:drawing>
+          <wp:inline distT="0" distB="0" distL="0" distR="0" wp14:anchorId="1C2B0E32" wp14:editId="3ACC61CA">
+            <wp:extent cx="5943600" cy="2840355"/>
+            <wp:effectExtent l="0" t="0" r="0" b="0"/>
+            <wp:docPr id="830682913" name="Picture 1"/>
+            <wp:cNvGraphicFramePr>
+              <a:graphicFrameLocks xmlns:a="http://schemas.openxmlformats.org/drawingml/2006/main" noChangeAspect="1"/>
+            </wp:cNvGraphicFramePr>
+            <a:graphic xmlns:a="http://schemas.openxmlformats.org/drawingml/2006/main">
+              <a:graphicData uri="http://schemas.openxmlformats.org/drawingml/2006/picture">
+                <pic:pic xmlns:pic="http://schemas.openxmlformats.org/drawingml/2006/picture">
+                  <pic:nvPicPr>
+                    <pic:cNvPr id="830682913" name=""/>
+                    <pic:cNvPicPr/>
+                  </pic:nvPicPr>
+                  <pic:blipFill>
+                    <a:blip r:embed="rId23"/>
+                    <a:stretch>
+                      <a:fillRect/>
+                    </a:stretch>
+                  </pic:blipFill>
+                  <pic:spPr>
+                    <a:xfrm>
+                      <a:off x="0" y="0"/>
+                      <a:ext cx="5943600" cy="2840355"/>
+                    </a:xfrm>
+                    <a:prstGeom prst="rect">
+                      <a:avLst/>
+                    </a:prstGeom>
+                  </pic:spPr>
+                </pic:pic>
+              </a:graphicData>
+            </a:graphic>
+          </wp:inline>
+        </w:drawing>
+      </w:r>
+    </w:p>
+    <w:p>
+      <w:pPr>
+        <w:widowControl w:val="0"/>
+        <w:spacing w:before="120" w:after="120" w:line="312" w:lineRule="auto"/>
         <w:ind w:left="764"/>
+        <w:jc w:val="center"/>
+        <w:rPr>
+          <w:b/>
+          <w:bCs/>
+          <w:noProof/>
+          <w:sz w:val="26"/>
+          <w:szCs w:val="26"/>
+        </w:rPr>
+      </w:pPr>
+      <w:r>
+        <w:rPr>
+          <w:b/>
+          <w:bCs/>
+          <w:noProof/>
+          <w:sz w:val="26"/>
+          <w:szCs w:val="26"/>
+        </w:rPr>
+        <w:t xml:space="preserve">Hình </w:t>
+      </w:r>
+      <w:r>
+        <w:rPr>
+          <w:b/>
+          <w:bCs/>
+          <w:noProof/>
+          <w:sz w:val="26"/>
+          <w:szCs w:val="26"/>
+        </w:rPr>
+        <w:t>5.</w:t>
+      </w:r>
+      <w:r>
+        <w:rPr>
+          <w:b/>
+          <w:bCs/>
+          <w:noProof/>
+          <w:sz w:val="26"/>
+          <w:szCs w:val="26"/>
+        </w:rPr>
+        <w:t>10</w:t>
+      </w:r>
+      <w:r>
+        <w:rPr>
+          <w:b/>
+          <w:bCs/>
+          <w:noProof/>
+          <w:sz w:val="26"/>
+          <w:szCs w:val="26"/>
+        </w:rPr>
+        <w:t>:</w:t>
+      </w:r>
+      <w:r>
+        <w:rPr>
+          <w:noProof/>
+          <w:sz w:val="26"/>
+          <w:szCs w:val="26"/>
+        </w:rPr>
+        <w:t xml:space="preserve"> </w:t>
+      </w:r>
+      <w:r>
+        <w:rPr>
+          <w:noProof/>
+          <w:sz w:val="26"/>
+          <w:szCs w:val="26"/>
+        </w:rPr>
+        <w:t>K</w:t>
+      </w:r>
+      <w:r>
+        <w:rPr>
+          <w:noProof/>
+          <w:sz w:val="26"/>
+          <w:szCs w:val="26"/>
+        </w:rPr>
+        <w:t>ết quả tổng hợp</w:t>
+      </w:r>
+      <w:r>
+        <w:rPr>
+          <w:noProof/>
+          <w:sz w:val="26"/>
+          <w:szCs w:val="26"/>
+        </w:rPr>
+        <w:t xml:space="preserve"> thống kê theo mức độ nhận thức</w:t>
+      </w:r>
+    </w:p>
+    <w:p>
+      <w:pPr>
+        <w:widowControl w:val="0"/>
+        <w:spacing w:before="120" w:after="120" w:line="312" w:lineRule="auto"/>
+        <w:ind w:left="764"/>
         <w:rPr>
           <w:b/>
           <w:bCs/>
@@ -10031,69 +10138,170 @@
           <w:sz w:val="26"/>
           <w:szCs w:val="26"/>
         </w:rPr>
-        <w:t>Hệ thống hỗ trợ giáo viên:</w:t>
+        <w:t>Dựa vào phiên làm bài cuối của HSSV, hệ thống thống kê tỷ lệ % cho các mức nhận thức, qua đó giúp cho giáo viên có cái nhìn tổng quan v</w:t>
+      </w:r>
+      <w:r>
+        <w:rPr>
+          <w:noProof/>
+          <w:sz w:val="26"/>
+          <w:szCs w:val="26"/>
+        </w:rPr>
+        <w:t>ề nhóm HSSV  này.</w:t>
       </w:r>
     </w:p>
     <w:p>
       <w:pPr>
         <w:widowControl w:val="0"/>
-        <w:numPr>
-          <w:ilvl w:val="0"/>
-          <w:numId w:val="9"/>
-        </w:numPr>
-        <w:spacing w:before="120" w:after="120" w:line="312" w:lineRule="auto"/>
-        <w:rPr>
-          <w:noProof/>
-          <w:sz w:val="26"/>
-          <w:szCs w:val="26"/>
-        </w:rPr>
-      </w:pPr>
-      <w:r>
-        <w:rPr>
-          <w:noProof/>
-          <w:sz w:val="26"/>
-          <w:szCs w:val="26"/>
-        </w:rPr>
-        <w:t xml:space="preserve">Xem kết quả theo từng sinh viên </w:t>
+        <w:spacing w:before="120" w:after="120" w:line="312" w:lineRule="auto"/>
+        <w:rPr>
+          <w:noProof/>
+          <w:sz w:val="26"/>
+          <w:szCs w:val="26"/>
+        </w:rPr>
+      </w:pPr>
+      <w:r>
+        <w:rPr>
+          <w:noProof/>
+        </w:rPr>
+        <w:drawing>
+          <wp:inline distT="0" distB="0" distL="0" distR="0" wp14:anchorId="1FEAC27B" wp14:editId="41527D67">
+            <wp:extent cx="5943600" cy="1600200"/>
+            <wp:effectExtent l="0" t="0" r="0" b="0"/>
+            <wp:docPr id="149763068" name="Picture 1"/>
+            <wp:cNvGraphicFramePr>
+              <a:graphicFrameLocks xmlns:a="http://schemas.openxmlformats.org/drawingml/2006/main" noChangeAspect="1"/>
+            </wp:cNvGraphicFramePr>
+            <a:graphic xmlns:a="http://schemas.openxmlformats.org/drawingml/2006/main">
+              <a:graphicData uri="http://schemas.openxmlformats.org/drawingml/2006/picture">
+                <pic:pic xmlns:pic="http://schemas.openxmlformats.org/drawingml/2006/picture">
+                  <pic:nvPicPr>
+                    <pic:cNvPr id="1391767594" name=""/>
+                    <pic:cNvPicPr/>
+                  </pic:nvPicPr>
+                  <pic:blipFill rotWithShape="1">
+                    <a:blip r:embed="rId22"/>
+                    <a:srcRect b="43510"/>
+                    <a:stretch>
+                      <a:fillRect/>
+                    </a:stretch>
+                  </pic:blipFill>
+                  <pic:spPr bwMode="auto">
+                    <a:xfrm>
+                      <a:off x="0" y="0"/>
+                      <a:ext cx="5943600" cy="1600200"/>
+                    </a:xfrm>
+                    <a:prstGeom prst="rect">
+                      <a:avLst/>
+                    </a:prstGeom>
+                    <a:ln>
+                      <a:noFill/>
+                    </a:ln>
+                    <a:extLst>
+                      <a:ext uri="{53640926-AAD7-44D8-BBD7-CCE9431645EC}">
+                        <a14:shadowObscured xmlns:a14="http://schemas.microsoft.com/office/drawing/2010/main"/>
+                      </a:ext>
+                    </a:extLst>
+                  </pic:spPr>
+                </pic:pic>
+              </a:graphicData>
+            </a:graphic>
+          </wp:inline>
+        </w:drawing>
       </w:r>
     </w:p>
     <w:p>
       <w:pPr>
         <w:widowControl w:val="0"/>
-        <w:numPr>
-          <w:ilvl w:val="0"/>
-          <w:numId w:val="9"/>
-        </w:numPr>
-        <w:spacing w:before="120" w:after="120" w:line="312" w:lineRule="auto"/>
-        <w:rPr>
-          <w:noProof/>
-          <w:sz w:val="26"/>
-          <w:szCs w:val="26"/>
-        </w:rPr>
-      </w:pPr>
-      <w:r>
-        <w:rPr>
-          <w:noProof/>
-          <w:sz w:val="26"/>
-          <w:szCs w:val="26"/>
-        </w:rPr>
-        <w:t xml:space="preserve">Theo dõi </w:t>
-      </w:r>
-      <w:r>
-        <w:rPr>
-          <w:noProof/>
-          <w:sz w:val="26"/>
-          <w:szCs w:val="26"/>
-        </w:rPr>
-        <w:t xml:space="preserve">các </w:t>
-      </w:r>
-      <w:r>
-        <w:rPr>
-          <w:noProof/>
-          <w:sz w:val="26"/>
-          <w:szCs w:val="26"/>
-        </w:rPr>
-        <w:t xml:space="preserve">lần làm bài </w:t>
+        <w:spacing w:before="120" w:after="120" w:line="312" w:lineRule="auto"/>
+        <w:ind w:left="764"/>
+        <w:jc w:val="center"/>
+        <w:rPr>
+          <w:b/>
+          <w:bCs/>
+          <w:noProof/>
+          <w:sz w:val="26"/>
+          <w:szCs w:val="26"/>
+        </w:rPr>
+      </w:pPr>
+      <w:r>
+        <w:rPr>
+          <w:b/>
+          <w:bCs/>
+          <w:noProof/>
+          <w:sz w:val="26"/>
+          <w:szCs w:val="26"/>
+        </w:rPr>
+        <w:t xml:space="preserve">Hình </w:t>
+      </w:r>
+      <w:r>
+        <w:rPr>
+          <w:b/>
+          <w:bCs/>
+          <w:noProof/>
+          <w:sz w:val="26"/>
+          <w:szCs w:val="26"/>
+        </w:rPr>
+        <w:t>5.1</w:t>
+      </w:r>
+      <w:r>
+        <w:rPr>
+          <w:b/>
+          <w:bCs/>
+          <w:noProof/>
+          <w:sz w:val="26"/>
+          <w:szCs w:val="26"/>
+        </w:rPr>
+        <w:t>1</w:t>
+      </w:r>
+      <w:r>
+        <w:rPr>
+          <w:b/>
+          <w:bCs/>
+          <w:noProof/>
+          <w:sz w:val="26"/>
+          <w:szCs w:val="26"/>
+        </w:rPr>
+        <w:t>:</w:t>
+      </w:r>
+      <w:r>
+        <w:rPr>
+          <w:noProof/>
+          <w:sz w:val="26"/>
+          <w:szCs w:val="26"/>
+        </w:rPr>
+        <w:t xml:space="preserve"> </w:t>
+      </w:r>
+      <w:r>
+        <w:rPr>
+          <w:noProof/>
+          <w:sz w:val="26"/>
+          <w:szCs w:val="26"/>
+        </w:rPr>
+        <w:t>K</w:t>
+      </w:r>
+      <w:r>
+        <w:rPr>
+          <w:noProof/>
+          <w:sz w:val="26"/>
+          <w:szCs w:val="26"/>
+        </w:rPr>
+        <w:t xml:space="preserve">ết quả </w:t>
+      </w:r>
+      <w:r>
+        <w:rPr>
+          <w:noProof/>
+          <w:sz w:val="26"/>
+          <w:szCs w:val="26"/>
+        </w:rPr>
+        <w:t>phân tích</w:t>
+      </w:r>
+      <w:r>
+        <w:rPr>
+          <w:noProof/>
+          <w:sz w:val="26"/>
+          <w:szCs w:val="26"/>
+        </w:rPr>
+        <w:t xml:space="preserve"> mức độ nhận thức</w:t>
       </w:r>
     </w:p>
     <w:p>
@@ -10253,6 +10461,7 @@
           <w:sz w:val="26"/>
           <w:szCs w:val="26"/>
         </w:rPr>
+        <w:lastRenderedPageBreak/>
         <w:t xml:space="preserve">level (cấp độ Bloom) </w:t>
       </w:r>
     </w:p>
@@ -10288,7 +10497,7 @@
                     <pic:cNvPicPr/>
                   </pic:nvPicPr>
                   <pic:blipFill>
-                    <a:blip r:embed="rId23"/>
+                    <a:blip r:embed="rId24"/>
                     <a:stretch>
                       <a:fillRect/>
                     </a:stretch>
@@ -10337,7 +10546,6 @@
           <w:sz w:val="26"/>
           <w:szCs w:val="26"/>
         </w:rPr>
-        <w:lastRenderedPageBreak/>
         <w:t xml:space="preserve">Hình </w:t>
       </w:r>
       <w:r>
@@ -10510,7 +10718,7 @@
                     <pic:cNvPicPr/>
                   </pic:nvPicPr>
                   <pic:blipFill>
-                    <a:blip r:embed="rId23"/>
+                    <a:blip r:embed="rId24"/>
                     <a:stretch>
                       <a:fillRect/>
                     </a:stretch>
@@ -10727,6 +10935,7 @@
           <w:sz w:val="26"/>
           <w:szCs w:val="26"/>
         </w:rPr>
+        <w:lastRenderedPageBreak/>
         <w:t>Những kết quả mà ứng dụng đạt được</w:t>
       </w:r>
     </w:p>
@@ -10986,7 +11195,6 @@
           <w:sz w:val="26"/>
           <w:szCs w:val="26"/>
         </w:rPr>
-        <w:lastRenderedPageBreak/>
         <w:t>Trong thời gian triển khai, hệ thống được dùng cho 3 hoạt động chính:</w:t>
       </w:r>
     </w:p>
@@ -11938,6 +12146,7 @@
                 <w:sz w:val="26"/>
                 <w:szCs w:val="26"/>
               </w:rPr>
+              <w:lastRenderedPageBreak/>
               <w:t>Tiêu chí</w:t>
             </w:r>
           </w:p>
@@ -12407,7 +12616,6 @@
                 <w:sz w:val="26"/>
                 <w:szCs w:val="26"/>
               </w:rPr>
-              <w:lastRenderedPageBreak/>
               <w:t>Mức độ kỹ năng (Bloom)</w:t>
             </w:r>
           </w:p>
@@ -13325,6 +13533,7 @@
                 <w:sz w:val="26"/>
                 <w:szCs w:val="26"/>
               </w:rPr>
+              <w:lastRenderedPageBreak/>
               <w:t>Độ chính xác khi chấm</w:t>
             </w:r>
           </w:p>
@@ -13608,15 +13817,7 @@
           <w:sz w:val="26"/>
           <w:szCs w:val="26"/>
         </w:rPr>
-        <w:t xml:space="preserve">“CodeBloom giúp tôi kiểm soát tiến độ học tập từng sinh viên </w:t>
-      </w:r>
-      <w:r>
-        <w:rPr>
-          <w:sz w:val="26"/>
-          <w:szCs w:val="26"/>
-        </w:rPr>
-        <w:lastRenderedPageBreak/>
-        <w:t>rất dễ, tiết kiệm rất nhiều thời gian chấm và thống kê điểm.”</w:t>
+        <w:t>“CodeBloom giúp tôi kiểm soát tiến độ học tập từng sinh viên rất dễ, tiết kiệm rất nhiều thời gian chấm và thống kê điểm.”</w:t>
       </w:r>
     </w:p>
     <w:p>
@@ -14042,6 +14243,7 @@
           <w:sz w:val="26"/>
           <w:szCs w:val="26"/>
         </w:rPr>
+        <w:lastRenderedPageBreak/>
         <w:t xml:space="preserve">Có thể </w:t>
       </w:r>
       <w:r>
@@ -14312,7 +14514,6 @@
           <w:sz w:val="26"/>
           <w:szCs w:val="26"/>
         </w:rPr>
-        <w:lastRenderedPageBreak/>
         <w:t xml:space="preserve">5. </w:t>
       </w:r>
       <w:r>
@@ -14535,6 +14736,7 @@
           <w:sz w:val="26"/>
           <w:szCs w:val="26"/>
         </w:rPr>
+        <w:lastRenderedPageBreak/>
         <w:t>5.</w:t>
       </w:r>
       <w:r>
@@ -14721,7 +14923,6 @@
           <w:sz w:val="26"/>
           <w:szCs w:val="26"/>
         </w:rPr>
-        <w:lastRenderedPageBreak/>
         <w:t xml:space="preserve">Tích hợp các môn học khác </w:t>
       </w:r>
     </w:p>
@@ -14997,6 +15198,7 @@
           <w:sz w:val="26"/>
           <w:szCs w:val="26"/>
         </w:rPr>
+        <w:lastRenderedPageBreak/>
         <w:t>Trong điều kiện cơ sở vật chất còn hạn chế, việc triển khai có thể gặp khó khăn, đặc biệt ở các đơn vị chưa quen với công nghệ.</w:t>
       </w:r>
     </w:p>
@@ -15218,7 +15420,6 @@
           <w:sz w:val="26"/>
           <w:szCs w:val="26"/>
         </w:rPr>
-        <w:lastRenderedPageBreak/>
         <w:t xml:space="preserve">Trắc nghiệm </w:t>
       </w:r>
     </w:p>
@@ -15557,6 +15758,7 @@
           <w:sz w:val="26"/>
           <w:szCs w:val="26"/>
         </w:rPr>
+        <w:lastRenderedPageBreak/>
         <w:t>Một số bước như:</w:t>
       </w:r>
     </w:p>
@@ -16439,7 +16641,7 @@
           <w:szCs w:val="26"/>
         </w:rPr>
       </w:pPr>
-      <w:hyperlink r:id="rId24" w:tgtFrame="_new" w:history="1">
+      <w:hyperlink r:id="rId25" w:tgtFrame="_new" w:history="1">
         <w:r>
           <w:rPr>
             <w:rStyle w:val="Hyperlink"/>
@@ -16460,7 +16662,7 @@
         </w:rPr>
         <w:t xml:space="preserve"> </w:t>
       </w:r>
-      <w:hyperlink r:id="rId25" w:tgtFrame="_blank" w:history="1">
+      <w:hyperlink r:id="rId26" w:tgtFrame="_blank" w:history="1">
         <w:r>
           <w:rPr>
             <w:rStyle w:val="max-w-15ch"/>
@@ -16522,7 +16724,7 @@
           <w:szCs w:val="26"/>
         </w:rPr>
       </w:pPr>
-      <w:hyperlink r:id="rId26" w:tgtFrame="_new" w:history="1">
+      <w:hyperlink r:id="rId27" w:tgtFrame="_new" w:history="1">
         <w:r>
           <w:rPr>
             <w:rStyle w:val="Hyperlink"/>
@@ -16543,7 +16745,7 @@
         </w:rPr>
         <w:t xml:space="preserve">” </w:t>
       </w:r>
-      <w:hyperlink r:id="rId27" w:tgtFrame="_blank" w:history="1">
+      <w:hyperlink r:id="rId28" w:tgtFrame="_blank" w:history="1">
         <w:r>
           <w:rPr>
             <w:rStyle w:val="max-w-15ch"/>
@@ -16590,7 +16792,7 @@
         </w:rPr>
         <w:t xml:space="preserve">Hướng dẫn tạo lớp học trực tuyến trên MyAloha </w:t>
       </w:r>
-      <w:hyperlink r:id="rId28" w:tgtFrame="_blank" w:history="1">
+      <w:hyperlink r:id="rId29" w:tgtFrame="_blank" w:history="1">
         <w:r>
           <w:rPr>
             <w:rStyle w:val="max-w-15ch"/>
@@ -16640,7 +16842,7 @@
           <w:szCs w:val="26"/>
         </w:rPr>
       </w:pPr>
-      <w:hyperlink r:id="rId29" w:tgtFrame="_new" w:history="1">
+      <w:hyperlink r:id="rId30" w:tgtFrame="_new" w:history="1">
         <w:r>
           <w:rPr>
             <w:rStyle w:val="Hyperlink"/>
@@ -16661,7 +16863,7 @@
         </w:rPr>
         <w:t xml:space="preserve"> </w:t>
       </w:r>
-      <w:hyperlink r:id="rId30" w:tgtFrame="_blank" w:history="1">
+      <w:hyperlink r:id="rId31" w:tgtFrame="_blank" w:history="1">
         <w:r>
           <w:rPr>
             <w:rStyle w:val="max-w-15ch"/>
@@ -17384,23 +17586,7 @@
                 <w:b/>
                 <w:noProof/>
               </w:rPr>
-              <w:t>MỞ Đ</w:t>
-            </w:r>
-            <w:r>
-              <w:rPr>
-                <w:rStyle w:val="Hyperlink"/>
-                <w:b/>
-                <w:noProof/>
-              </w:rPr>
-              <w:t>Ầ</w:t>
-            </w:r>
-            <w:r>
-              <w:rPr>
-                <w:rStyle w:val="Hyperlink"/>
-                <w:b/>
-                <w:noProof/>
-              </w:rPr>
-              <w:t>U</w:t>
+              <w:t>MỞ ĐẦU</w:t>
             </w:r>
             <w:r>
               <w:rPr>
@@ -18956,7 +19142,6 @@
     </w:p>
     <w:tbl>
       <w:tblPr>
-        <w:tblStyle w:val="TOCHeading"/>
         <w:tblW w:w="0" w:type="auto"/>
         <w:tblCellMar>
           <w:top w:w="50" w:type="dxa"/>
@@ -18991,19 +19176,16 @@
             <w:pPr>
               <w:ind w:left="19"/>
               <w:rPr>
-                <w:rFonts w:ascii="Times New Roman" w:hAnsi="Times New Roman" w:cs="Times New Roman"/>
                 <w:sz w:val="26"/>
                 <w:szCs w:val="26"/>
               </w:rPr>
             </w:pPr>
             <w:r>
               <w:rPr>
-                <w:rFonts w:ascii="Times New Roman" w:eastAsia="Times New Roman" w:hAnsi="Times New Roman" w:cs="Times New Roman"/>
                 <w:b/>
                 <w:sz w:val="26"/>
                 <w:szCs w:val="26"/>
               </w:rPr>
-              <w:lastRenderedPageBreak/>
               <w:t xml:space="preserve">STT </w:t>
             </w:r>
           </w:p>
@@ -19024,14 +19206,12 @@
               <w:ind w:right="99"/>
               <w:jc w:val="center"/>
               <w:rPr>
-                <w:rFonts w:ascii="Times New Roman" w:hAnsi="Times New Roman" w:cs="Times New Roman"/>
                 <w:sz w:val="26"/>
                 <w:szCs w:val="26"/>
               </w:rPr>
             </w:pPr>
             <w:r>
               <w:rPr>
-                <w:rFonts w:ascii="Times New Roman" w:eastAsia="Times New Roman" w:hAnsi="Times New Roman" w:cs="Times New Roman"/>
                 <w:b/>
                 <w:sz w:val="26"/>
                 <w:szCs w:val="26"/>
@@ -19058,14 +19238,12 @@
               <w:ind w:right="101"/>
               <w:jc w:val="center"/>
               <w:rPr>
-                <w:rFonts w:ascii="Times New Roman" w:hAnsi="Times New Roman" w:cs="Times New Roman"/>
                 <w:sz w:val="26"/>
                 <w:szCs w:val="26"/>
               </w:rPr>
             </w:pPr>
             <w:r>
               <w:rPr>
-                <w:rFonts w:ascii="Times New Roman" w:eastAsia="Times New Roman" w:hAnsi="Times New Roman" w:cs="Times New Roman"/>
                 <w:b/>
                 <w:sz w:val="26"/>
                 <w:szCs w:val="26"/>
@@ -19078,14 +19256,12 @@
               <w:ind w:right="99"/>
               <w:jc w:val="center"/>
               <w:rPr>
-                <w:rFonts w:ascii="Times New Roman" w:hAnsi="Times New Roman" w:cs="Times New Roman"/>
                 <w:sz w:val="26"/>
                 <w:szCs w:val="26"/>
               </w:rPr>
             </w:pPr>
             <w:r>
               <w:rPr>
-                <w:rFonts w:ascii="Times New Roman" w:eastAsia="Times New Roman" w:hAnsi="Times New Roman" w:cs="Times New Roman"/>
                 <w:b/>
                 <w:sz w:val="26"/>
                 <w:szCs w:val="26"/>
@@ -19115,14 +19291,12 @@
               <w:ind w:right="98"/>
               <w:jc w:val="center"/>
               <w:rPr>
-                <w:rFonts w:ascii="Times New Roman" w:hAnsi="Times New Roman" w:cs="Times New Roman"/>
                 <w:sz w:val="26"/>
                 <w:szCs w:val="26"/>
               </w:rPr>
             </w:pPr>
             <w:r>
               <w:rPr>
-                <w:rFonts w:ascii="Times New Roman" w:eastAsia="Times New Roman" w:hAnsi="Times New Roman" w:cs="Times New Roman"/>
                 <w:b/>
                 <w:sz w:val="26"/>
                 <w:szCs w:val="26"/>
@@ -19145,14 +19319,12 @@
           <w:p>
             <w:pPr>
               <w:rPr>
-                <w:rFonts w:ascii="Times New Roman" w:hAnsi="Times New Roman" w:cs="Times New Roman"/>
                 <w:sz w:val="26"/>
                 <w:szCs w:val="26"/>
               </w:rPr>
             </w:pPr>
             <w:r>
               <w:rPr>
-                <w:rFonts w:ascii="Times New Roman" w:eastAsia="Times New Roman" w:hAnsi="Times New Roman" w:cs="Times New Roman"/>
                 <w:b/>
                 <w:sz w:val="26"/>
                 <w:szCs w:val="26"/>
@@ -19176,7 +19348,6 @@
             <w:pPr>
               <w:ind w:left="-9655" w:right="224"/>
               <w:rPr>
-                <w:rFonts w:ascii="Times New Roman" w:hAnsi="Times New Roman" w:cs="Times New Roman"/>
                 <w:sz w:val="26"/>
                 <w:szCs w:val="26"/>
               </w:rPr>
@@ -19184,7 +19355,6 @@
           </w:p>
           <w:tbl>
             <w:tblPr>
-              <w:tblStyle w:val="TOCHeading"/>
               <w:tblW w:w="803" w:type="dxa"/>
               <w:tblInd w:w="135" w:type="dxa"/>
               <w:tblCellMar>
@@ -19215,14 +19385,12 @@
                     <w:ind w:left="57"/>
                     <w:jc w:val="center"/>
                     <w:rPr>
-                      <w:rFonts w:ascii="Times New Roman" w:hAnsi="Times New Roman" w:cs="Times New Roman"/>
                       <w:sz w:val="26"/>
                       <w:szCs w:val="26"/>
                     </w:rPr>
                   </w:pPr>
                   <w:r>
                     <w:rPr>
-                      <w:rFonts w:ascii="Times New Roman" w:hAnsi="Times New Roman" w:cs="Times New Roman"/>
                       <w:sz w:val="26"/>
                       <w:szCs w:val="26"/>
                     </w:rPr>
@@ -19236,7 +19404,6 @@
             <w:pPr>
               <w:spacing w:after="160"/>
               <w:rPr>
-                <w:rFonts w:ascii="Times New Roman" w:hAnsi="Times New Roman" w:cs="Times New Roman"/>
                 <w:sz w:val="26"/>
                 <w:szCs w:val="26"/>
               </w:rPr>
@@ -19263,14 +19430,12 @@
               <w:ind w:right="98"/>
               <w:jc w:val="center"/>
               <w:rPr>
-                <w:rFonts w:ascii="Times New Roman" w:hAnsi="Times New Roman" w:cs="Times New Roman"/>
                 <w:sz w:val="26"/>
                 <w:szCs w:val="26"/>
               </w:rPr>
             </w:pPr>
             <w:r>
               <w:rPr>
-                <w:rFonts w:ascii="Times New Roman" w:hAnsi="Times New Roman" w:cs="Times New Roman"/>
                 <w:sz w:val="26"/>
                 <w:szCs w:val="26"/>
               </w:rPr>
@@ -19291,14 +19456,12 @@
           <w:p>
             <w:pPr>
               <w:rPr>
-                <w:rFonts w:ascii="Times New Roman" w:hAnsi="Times New Roman" w:cs="Times New Roman"/>
                 <w:sz w:val="26"/>
                 <w:szCs w:val="26"/>
               </w:rPr>
             </w:pPr>
             <w:r>
               <w:rPr>
-                <w:rFonts w:ascii="Times New Roman" w:hAnsi="Times New Roman" w:cs="Times New Roman"/>
                 <w:sz w:val="26"/>
                 <w:szCs w:val="26"/>
               </w:rPr>
@@ -19322,14 +19485,12 @@
               <w:ind w:right="96"/>
               <w:jc w:val="center"/>
               <w:rPr>
-                <w:rFonts w:ascii="Times New Roman" w:hAnsi="Times New Roman" w:cs="Times New Roman"/>
                 <w:sz w:val="26"/>
                 <w:szCs w:val="26"/>
               </w:rPr>
             </w:pPr>
             <w:r>
               <w:rPr>
-                <w:rFonts w:ascii="Times New Roman" w:hAnsi="Times New Roman" w:cs="Times New Roman"/>
                 <w:sz w:val="26"/>
                 <w:szCs w:val="26"/>
               </w:rPr>
@@ -19357,14 +19518,12 @@
               <w:ind w:right="98"/>
               <w:jc w:val="center"/>
               <w:rPr>
-                <w:rFonts w:ascii="Times New Roman" w:hAnsi="Times New Roman" w:cs="Times New Roman"/>
                 <w:sz w:val="26"/>
                 <w:szCs w:val="26"/>
               </w:rPr>
             </w:pPr>
             <w:r>
               <w:rPr>
-                <w:rFonts w:ascii="Times New Roman" w:hAnsi="Times New Roman" w:cs="Times New Roman"/>
                 <w:sz w:val="26"/>
                 <w:szCs w:val="26"/>
               </w:rPr>
@@ -19386,14 +19545,12 @@
           <w:p>
             <w:pPr>
               <w:rPr>
-                <w:rFonts w:ascii="Times New Roman" w:hAnsi="Times New Roman" w:cs="Times New Roman"/>
                 <w:sz w:val="26"/>
                 <w:szCs w:val="26"/>
               </w:rPr>
             </w:pPr>
             <w:r>
               <w:rPr>
-                <w:rFonts w:ascii="Times New Roman" w:hAnsi="Times New Roman" w:cs="Times New Roman"/>
                 <w:sz w:val="26"/>
                 <w:szCs w:val="26"/>
               </w:rPr>
@@ -19417,14 +19574,12 @@
               <w:ind w:right="96"/>
               <w:jc w:val="center"/>
               <w:rPr>
-                <w:rFonts w:ascii="Times New Roman" w:hAnsi="Times New Roman" w:cs="Times New Roman"/>
                 <w:sz w:val="26"/>
                 <w:szCs w:val="26"/>
               </w:rPr>
             </w:pPr>
             <w:r>
               <w:rPr>
-                <w:rFonts w:ascii="Times New Roman" w:hAnsi="Times New Roman" w:cs="Times New Roman"/>
                 <w:sz w:val="26"/>
                 <w:szCs w:val="26"/>
               </w:rPr>
@@ -19452,14 +19607,12 @@
               <w:ind w:right="98"/>
               <w:jc w:val="center"/>
               <w:rPr>
-                <w:rFonts w:ascii="Times New Roman" w:hAnsi="Times New Roman" w:cs="Times New Roman"/>
                 <w:sz w:val="26"/>
                 <w:szCs w:val="26"/>
               </w:rPr>
             </w:pPr>
             <w:r>
               <w:rPr>
-                <w:rFonts w:ascii="Times New Roman" w:hAnsi="Times New Roman" w:cs="Times New Roman"/>
                 <w:sz w:val="26"/>
                 <w:szCs w:val="26"/>
               </w:rPr>
@@ -19480,14 +19633,12 @@
           <w:p>
             <w:pPr>
               <w:rPr>
-                <w:rFonts w:ascii="Times New Roman" w:hAnsi="Times New Roman" w:cs="Times New Roman"/>
                 <w:sz w:val="26"/>
                 <w:szCs w:val="26"/>
               </w:rPr>
             </w:pPr>
             <w:r>
               <w:rPr>
-                <w:rFonts w:ascii="Times New Roman" w:hAnsi="Times New Roman" w:cs="Times New Roman"/>
                 <w:sz w:val="26"/>
                 <w:szCs w:val="26"/>
               </w:rPr>
@@ -19511,14 +19662,12 @@
               <w:ind w:right="96"/>
               <w:jc w:val="center"/>
               <w:rPr>
-                <w:rFonts w:ascii="Times New Roman" w:hAnsi="Times New Roman" w:cs="Times New Roman"/>
                 <w:sz w:val="26"/>
                 <w:szCs w:val="26"/>
               </w:rPr>
             </w:pPr>
             <w:r>
               <w:rPr>
-                <w:rFonts w:ascii="Times New Roman" w:hAnsi="Times New Roman" w:cs="Times New Roman"/>
                 <w:sz w:val="26"/>
                 <w:szCs w:val="26"/>
               </w:rPr>
@@ -19546,14 +19695,12 @@
               <w:ind w:right="98"/>
               <w:jc w:val="center"/>
               <w:rPr>
-                <w:rFonts w:ascii="Times New Roman" w:hAnsi="Times New Roman" w:cs="Times New Roman"/>
                 <w:sz w:val="26"/>
                 <w:szCs w:val="26"/>
               </w:rPr>
             </w:pPr>
             <w:r>
               <w:rPr>
-                <w:rFonts w:ascii="Times New Roman" w:hAnsi="Times New Roman" w:cs="Times New Roman"/>
                 <w:sz w:val="26"/>
                 <w:szCs w:val="26"/>
               </w:rPr>
@@ -19574,14 +19721,12 @@
           <w:p>
             <w:pPr>
               <w:rPr>
-                <w:rFonts w:ascii="Times New Roman" w:hAnsi="Times New Roman" w:cs="Times New Roman"/>
                 <w:sz w:val="26"/>
                 <w:szCs w:val="26"/>
               </w:rPr>
             </w:pPr>
             <w:r>
               <w:rPr>
-                <w:rFonts w:ascii="Times New Roman" w:hAnsi="Times New Roman" w:cs="Times New Roman"/>
                 <w:sz w:val="26"/>
                 <w:szCs w:val="26"/>
               </w:rPr>
@@ -19605,14 +19750,12 @@
               <w:ind w:right="96"/>
               <w:jc w:val="center"/>
               <w:rPr>
-                <w:rFonts w:ascii="Times New Roman" w:hAnsi="Times New Roman" w:cs="Times New Roman"/>
                 <w:sz w:val="26"/>
                 <w:szCs w:val="26"/>
               </w:rPr>
             </w:pPr>
             <w:r>
               <w:rPr>
-                <w:rFonts w:ascii="Times New Roman" w:hAnsi="Times New Roman" w:cs="Times New Roman"/>
                 <w:sz w:val="26"/>
                 <w:szCs w:val="26"/>
               </w:rPr>
@@ -19640,14 +19783,12 @@
               <w:ind w:right="98"/>
               <w:jc w:val="center"/>
               <w:rPr>
-                <w:rFonts w:ascii="Times New Roman" w:hAnsi="Times New Roman" w:cs="Times New Roman"/>
                 <w:sz w:val="26"/>
                 <w:szCs w:val="26"/>
               </w:rPr>
             </w:pPr>
             <w:r>
               <w:rPr>
-                <w:rFonts w:ascii="Times New Roman" w:hAnsi="Times New Roman" w:cs="Times New Roman"/>
                 <w:sz w:val="26"/>
                 <w:szCs w:val="26"/>
               </w:rPr>
@@ -19669,14 +19810,12 @@
           <w:p>
             <w:pPr>
               <w:rPr>
-                <w:rFonts w:ascii="Times New Roman" w:hAnsi="Times New Roman" w:cs="Times New Roman"/>
                 <w:sz w:val="26"/>
                 <w:szCs w:val="26"/>
               </w:rPr>
             </w:pPr>
             <w:r>
               <w:rPr>
-                <w:rFonts w:ascii="Times New Roman" w:hAnsi="Times New Roman" w:cs="Times New Roman"/>
                 <w:sz w:val="26"/>
                 <w:szCs w:val="26"/>
               </w:rPr>
@@ -19700,14 +19839,12 @@
               <w:ind w:right="96"/>
               <w:jc w:val="center"/>
               <w:rPr>
-                <w:rFonts w:ascii="Times New Roman" w:hAnsi="Times New Roman" w:cs="Times New Roman"/>
                 <w:sz w:val="26"/>
                 <w:szCs w:val="26"/>
               </w:rPr>
             </w:pPr>
             <w:r>
               <w:rPr>
-                <w:rFonts w:ascii="Times New Roman" w:hAnsi="Times New Roman" w:cs="Times New Roman"/>
                 <w:sz w:val="26"/>
                 <w:szCs w:val="26"/>
               </w:rPr>
@@ -19735,14 +19872,12 @@
               <w:ind w:right="98"/>
               <w:jc w:val="center"/>
               <w:rPr>
-                <w:rFonts w:ascii="Times New Roman" w:hAnsi="Times New Roman" w:cs="Times New Roman"/>
                 <w:sz w:val="26"/>
                 <w:szCs w:val="26"/>
               </w:rPr>
             </w:pPr>
             <w:r>
               <w:rPr>
-                <w:rFonts w:ascii="Times New Roman" w:hAnsi="Times New Roman" w:cs="Times New Roman"/>
                 <w:sz w:val="26"/>
                 <w:szCs w:val="26"/>
               </w:rPr>
@@ -19763,14 +19898,12 @@
           <w:p>
             <w:pPr>
               <w:rPr>
-                <w:rFonts w:ascii="Times New Roman" w:hAnsi="Times New Roman" w:cs="Times New Roman"/>
                 <w:sz w:val="26"/>
                 <w:szCs w:val="26"/>
               </w:rPr>
             </w:pPr>
             <w:r>
               <w:rPr>
-                <w:rFonts w:ascii="Times New Roman" w:hAnsi="Times New Roman" w:cs="Times New Roman"/>
                 <w:sz w:val="26"/>
                 <w:szCs w:val="26"/>
               </w:rPr>
@@ -19794,14 +19927,12 @@
               <w:ind w:right="96"/>
               <w:jc w:val="center"/>
               <w:rPr>
-                <w:rFonts w:ascii="Times New Roman" w:hAnsi="Times New Roman" w:cs="Times New Roman"/>
                 <w:sz w:val="26"/>
                 <w:szCs w:val="26"/>
               </w:rPr>
             </w:pPr>
             <w:r>
               <w:rPr>
-                <w:rFonts w:ascii="Times New Roman" w:hAnsi="Times New Roman" w:cs="Times New Roman"/>
                 <w:sz w:val="26"/>
                 <w:szCs w:val="26"/>
               </w:rPr>
@@ -19830,14 +19961,12 @@
               <w:ind w:right="98"/>
               <w:jc w:val="center"/>
               <w:rPr>
-                <w:rFonts w:ascii="Times New Roman" w:hAnsi="Times New Roman" w:cs="Times New Roman"/>
                 <w:sz w:val="26"/>
                 <w:szCs w:val="26"/>
               </w:rPr>
             </w:pPr>
             <w:r>
               <w:rPr>
-                <w:rFonts w:ascii="Times New Roman" w:eastAsia="Times New Roman" w:hAnsi="Times New Roman" w:cs="Times New Roman"/>
                 <w:b/>
                 <w:sz w:val="26"/>
                 <w:szCs w:val="26"/>
@@ -19860,14 +19989,12 @@
           <w:p>
             <w:pPr>
               <w:rPr>
-                <w:rFonts w:ascii="Times New Roman" w:hAnsi="Times New Roman" w:cs="Times New Roman"/>
                 <w:sz w:val="26"/>
                 <w:szCs w:val="26"/>
               </w:rPr>
             </w:pPr>
             <w:r>
               <w:rPr>
-                <w:rFonts w:ascii="Times New Roman" w:eastAsia="Times New Roman" w:hAnsi="Times New Roman" w:cs="Times New Roman"/>
                 <w:b/>
                 <w:sz w:val="26"/>
                 <w:szCs w:val="26"/>
@@ -19891,7 +20018,6 @@
             <w:pPr>
               <w:ind w:left="234"/>
               <w:rPr>
-                <w:rFonts w:ascii="Times New Roman" w:hAnsi="Times New Roman" w:cs="Times New Roman"/>
                 <w:sz w:val="26"/>
                 <w:szCs w:val="26"/>
               </w:rPr>
@@ -20061,14 +20187,12 @@
               <w:ind w:right="98"/>
               <w:jc w:val="center"/>
               <w:rPr>
-                <w:rFonts w:ascii="Times New Roman" w:hAnsi="Times New Roman" w:cs="Times New Roman"/>
                 <w:sz w:val="26"/>
                 <w:szCs w:val="26"/>
               </w:rPr>
             </w:pPr>
             <w:r>
               <w:rPr>
-                <w:rFonts w:ascii="Times New Roman" w:hAnsi="Times New Roman" w:cs="Times New Roman"/>
                 <w:sz w:val="26"/>
                 <w:szCs w:val="26"/>
               </w:rPr>
@@ -20089,14 +20213,12 @@
           <w:p>
             <w:pPr>
               <w:rPr>
-                <w:rFonts w:ascii="Times New Roman" w:hAnsi="Times New Roman" w:cs="Times New Roman"/>
                 <w:sz w:val="26"/>
                 <w:szCs w:val="26"/>
               </w:rPr>
             </w:pPr>
             <w:r>
               <w:rPr>
-                <w:rFonts w:ascii="Times New Roman" w:hAnsi="Times New Roman" w:cs="Times New Roman"/>
                 <w:sz w:val="26"/>
                 <w:szCs w:val="26"/>
               </w:rPr>
@@ -20120,14 +20242,12 @@
               <w:ind w:right="96"/>
               <w:jc w:val="center"/>
               <w:rPr>
-                <w:rFonts w:ascii="Times New Roman" w:hAnsi="Times New Roman" w:cs="Times New Roman"/>
                 <w:sz w:val="26"/>
                 <w:szCs w:val="26"/>
               </w:rPr>
             </w:pPr>
             <w:r>
               <w:rPr>
-                <w:rFonts w:ascii="Times New Roman" w:hAnsi="Times New Roman" w:cs="Times New Roman"/>
                 <w:sz w:val="26"/>
                 <w:szCs w:val="26"/>
               </w:rPr>
@@ -20156,14 +20276,12 @@
               <w:ind w:right="98"/>
               <w:jc w:val="center"/>
               <w:rPr>
-                <w:rFonts w:ascii="Times New Roman" w:hAnsi="Times New Roman" w:cs="Times New Roman"/>
                 <w:sz w:val="26"/>
                 <w:szCs w:val="26"/>
               </w:rPr>
             </w:pPr>
             <w:r>
               <w:rPr>
-                <w:rFonts w:ascii="Times New Roman" w:hAnsi="Times New Roman" w:cs="Times New Roman"/>
                 <w:sz w:val="26"/>
                 <w:szCs w:val="26"/>
               </w:rPr>
@@ -20185,14 +20303,12 @@
           <w:p>
             <w:pPr>
               <w:rPr>
-                <w:rFonts w:ascii="Times New Roman" w:hAnsi="Times New Roman" w:cs="Times New Roman"/>
                 <w:sz w:val="26"/>
                 <w:szCs w:val="26"/>
               </w:rPr>
             </w:pPr>
             <w:r>
               <w:rPr>
-                <w:rFonts w:ascii="Times New Roman" w:hAnsi="Times New Roman" w:cs="Times New Roman"/>
                 <w:sz w:val="26"/>
                 <w:szCs w:val="26"/>
               </w:rPr>
@@ -20217,14 +20333,12 @@
               <w:ind w:right="96"/>
               <w:jc w:val="center"/>
               <w:rPr>
-                <w:rFonts w:ascii="Times New Roman" w:hAnsi="Times New Roman" w:cs="Times New Roman"/>
                 <w:sz w:val="26"/>
                 <w:szCs w:val="26"/>
               </w:rPr>
             </w:pPr>
             <w:r>
               <w:rPr>
-                <w:rFonts w:ascii="Times New Roman" w:hAnsi="Times New Roman" w:cs="Times New Roman"/>
                 <w:sz w:val="26"/>
                 <w:szCs w:val="26"/>
               </w:rPr>
@@ -20252,14 +20366,12 @@
               <w:ind w:right="98"/>
               <w:jc w:val="center"/>
               <w:rPr>
-                <w:rFonts w:ascii="Times New Roman" w:hAnsi="Times New Roman" w:cs="Times New Roman"/>
                 <w:sz w:val="26"/>
                 <w:szCs w:val="26"/>
               </w:rPr>
             </w:pPr>
             <w:r>
               <w:rPr>
-                <w:rFonts w:ascii="Times New Roman" w:hAnsi="Times New Roman" w:cs="Times New Roman"/>
                 <w:sz w:val="26"/>
                 <w:szCs w:val="26"/>
               </w:rPr>
@@ -20281,14 +20393,12 @@
           <w:p>
             <w:pPr>
               <w:rPr>
-                <w:rFonts w:ascii="Times New Roman" w:hAnsi="Times New Roman" w:cs="Times New Roman"/>
                 <w:sz w:val="26"/>
                 <w:szCs w:val="26"/>
               </w:rPr>
             </w:pPr>
             <w:r>
               <w:rPr>
-                <w:rFonts w:ascii="Times New Roman" w:hAnsi="Times New Roman" w:cs="Times New Roman"/>
                 <w:sz w:val="26"/>
                 <w:szCs w:val="26"/>
               </w:rPr>
@@ -20312,14 +20422,12 @@
               <w:ind w:right="96"/>
               <w:jc w:val="center"/>
               <w:rPr>
-                <w:rFonts w:ascii="Times New Roman" w:hAnsi="Times New Roman" w:cs="Times New Roman"/>
                 <w:sz w:val="26"/>
                 <w:szCs w:val="26"/>
               </w:rPr>
             </w:pPr>
             <w:r>
               <w:rPr>
-                <w:rFonts w:ascii="Times New Roman" w:hAnsi="Times New Roman" w:cs="Times New Roman"/>
                 <w:sz w:val="26"/>
                 <w:szCs w:val="26"/>
               </w:rPr>
@@ -20347,14 +20455,12 @@
               <w:ind w:right="98"/>
               <w:jc w:val="center"/>
               <w:rPr>
-                <w:rFonts w:ascii="Times New Roman" w:hAnsi="Times New Roman" w:cs="Times New Roman"/>
                 <w:sz w:val="26"/>
                 <w:szCs w:val="26"/>
               </w:rPr>
             </w:pPr>
             <w:r>
               <w:rPr>
-                <w:rFonts w:ascii="Times New Roman" w:hAnsi="Times New Roman" w:cs="Times New Roman"/>
                 <w:sz w:val="26"/>
                 <w:szCs w:val="26"/>
               </w:rPr>
@@ -20375,14 +20481,12 @@
           <w:p>
             <w:pPr>
               <w:rPr>
-                <w:rFonts w:ascii="Times New Roman" w:hAnsi="Times New Roman" w:cs="Times New Roman"/>
                 <w:sz w:val="26"/>
                 <w:szCs w:val="26"/>
               </w:rPr>
             </w:pPr>
             <w:r>
               <w:rPr>
-                <w:rFonts w:ascii="Times New Roman" w:hAnsi="Times New Roman" w:cs="Times New Roman"/>
                 <w:sz w:val="26"/>
                 <w:szCs w:val="26"/>
               </w:rPr>
@@ -20406,14 +20510,12 @@
               <w:ind w:right="96"/>
               <w:jc w:val="center"/>
               <w:rPr>
-                <w:rFonts w:ascii="Times New Roman" w:hAnsi="Times New Roman" w:cs="Times New Roman"/>
                 <w:sz w:val="26"/>
                 <w:szCs w:val="26"/>
               </w:rPr>
             </w:pPr>
             <w:r>
               <w:rPr>
-                <w:rFonts w:ascii="Times New Roman" w:hAnsi="Times New Roman" w:cs="Times New Roman"/>
                 <w:sz w:val="26"/>
                 <w:szCs w:val="26"/>
               </w:rPr>
@@ -20441,14 +20543,12 @@
               <w:ind w:right="98"/>
               <w:jc w:val="center"/>
               <w:rPr>
-                <w:rFonts w:ascii="Times New Roman" w:hAnsi="Times New Roman" w:cs="Times New Roman"/>
                 <w:sz w:val="26"/>
                 <w:szCs w:val="26"/>
               </w:rPr>
             </w:pPr>
             <w:r>
               <w:rPr>
-                <w:rFonts w:ascii="Times New Roman" w:eastAsia="Times New Roman" w:hAnsi="Times New Roman" w:cs="Times New Roman"/>
                 <w:b/>
                 <w:sz w:val="26"/>
                 <w:szCs w:val="26"/>
@@ -20470,14 +20570,12 @@
           <w:p>
             <w:pPr>
               <w:rPr>
-                <w:rFonts w:ascii="Times New Roman" w:hAnsi="Times New Roman" w:cs="Times New Roman"/>
                 <w:sz w:val="26"/>
                 <w:szCs w:val="26"/>
               </w:rPr>
             </w:pPr>
             <w:r>
               <w:rPr>
-                <w:rFonts w:ascii="Times New Roman" w:eastAsia="Times New Roman" w:hAnsi="Times New Roman" w:cs="Times New Roman"/>
                 <w:b/>
                 <w:sz w:val="26"/>
                 <w:szCs w:val="26"/>
@@ -20500,7 +20598,6 @@
             <w:pPr>
               <w:spacing w:after="160"/>
               <w:rPr>
-                <w:rFonts w:ascii="Times New Roman" w:hAnsi="Times New Roman" w:cs="Times New Roman"/>
                 <w:sz w:val="26"/>
                 <w:szCs w:val="26"/>
               </w:rPr>
@@ -20522,14 +20619,12 @@
               <w:ind w:right="54"/>
               <w:jc w:val="center"/>
               <w:rPr>
-                <w:rFonts w:ascii="Times New Roman" w:hAnsi="Times New Roman" w:cs="Times New Roman"/>
                 <w:sz w:val="26"/>
                 <w:szCs w:val="26"/>
               </w:rPr>
             </w:pPr>
             <w:r>
               <w:rPr>
-                <w:rFonts w:ascii="Times New Roman" w:hAnsi="Times New Roman" w:cs="Times New Roman"/>
                 <w:sz w:val="26"/>
                 <w:szCs w:val="26"/>
               </w:rPr>
@@ -20551,7 +20646,6 @@
             <w:pPr>
               <w:spacing w:after="160"/>
               <w:rPr>
-                <w:rFonts w:ascii="Times New Roman" w:hAnsi="Times New Roman" w:cs="Times New Roman"/>
                 <w:sz w:val="26"/>
                 <w:szCs w:val="26"/>
               </w:rPr>
@@ -20579,14 +20673,12 @@
               <w:ind w:right="98"/>
               <w:jc w:val="center"/>
               <w:rPr>
-                <w:rFonts w:ascii="Times New Roman" w:hAnsi="Times New Roman" w:cs="Times New Roman"/>
                 <w:sz w:val="26"/>
                 <w:szCs w:val="26"/>
               </w:rPr>
             </w:pPr>
             <w:r>
               <w:rPr>
-                <w:rFonts w:ascii="Times New Roman" w:hAnsi="Times New Roman" w:cs="Times New Roman"/>
                 <w:sz w:val="26"/>
                 <w:szCs w:val="26"/>
               </w:rPr>
@@ -20608,14 +20700,12 @@
           <w:p>
             <w:pPr>
               <w:rPr>
-                <w:rFonts w:ascii="Times New Roman" w:hAnsi="Times New Roman" w:cs="Times New Roman"/>
                 <w:sz w:val="26"/>
                 <w:szCs w:val="26"/>
               </w:rPr>
             </w:pPr>
             <w:r>
               <w:rPr>
-                <w:rFonts w:ascii="Times New Roman" w:hAnsi="Times New Roman" w:cs="Times New Roman"/>
                 <w:sz w:val="26"/>
                 <w:szCs w:val="26"/>
               </w:rPr>
@@ -20640,14 +20730,12 @@
               <w:ind w:right="96"/>
               <w:jc w:val="center"/>
               <w:rPr>
-                <w:rFonts w:ascii="Times New Roman" w:hAnsi="Times New Roman" w:cs="Times New Roman"/>
                 <w:sz w:val="26"/>
                 <w:szCs w:val="26"/>
               </w:rPr>
             </w:pPr>
             <w:r>
               <w:rPr>
-                <w:rFonts w:ascii="Times New Roman" w:hAnsi="Times New Roman" w:cs="Times New Roman"/>
                 <w:sz w:val="26"/>
                 <w:szCs w:val="26"/>
               </w:rPr>
@@ -20675,14 +20763,12 @@
               <w:ind w:right="98"/>
               <w:jc w:val="center"/>
               <w:rPr>
-                <w:rFonts w:ascii="Times New Roman" w:hAnsi="Times New Roman" w:cs="Times New Roman"/>
                 <w:sz w:val="26"/>
                 <w:szCs w:val="26"/>
               </w:rPr>
             </w:pPr>
             <w:r>
               <w:rPr>
-                <w:rFonts w:ascii="Times New Roman" w:hAnsi="Times New Roman" w:cs="Times New Roman"/>
                 <w:sz w:val="26"/>
                 <w:szCs w:val="26"/>
               </w:rPr>
@@ -20703,14 +20789,12 @@
           <w:p>
             <w:pPr>
               <w:rPr>
-                <w:rFonts w:ascii="Times New Roman" w:hAnsi="Times New Roman" w:cs="Times New Roman"/>
                 <w:sz w:val="26"/>
                 <w:szCs w:val="26"/>
               </w:rPr>
             </w:pPr>
             <w:r>
               <w:rPr>
-                <w:rFonts w:ascii="Times New Roman" w:hAnsi="Times New Roman" w:cs="Times New Roman"/>
                 <w:sz w:val="26"/>
                 <w:szCs w:val="26"/>
               </w:rPr>
@@ -20734,14 +20818,12 @@
               <w:ind w:right="96"/>
               <w:jc w:val="center"/>
               <w:rPr>
-                <w:rFonts w:ascii="Times New Roman" w:hAnsi="Times New Roman" w:cs="Times New Roman"/>
                 <w:sz w:val="26"/>
                 <w:szCs w:val="26"/>
               </w:rPr>
             </w:pPr>
             <w:r>
               <w:rPr>
-                <w:rFonts w:ascii="Times New Roman" w:hAnsi="Times New Roman" w:cs="Times New Roman"/>
                 <w:sz w:val="26"/>
                 <w:szCs w:val="26"/>
               </w:rPr>
@@ -20769,14 +20851,12 @@
               <w:ind w:right="98"/>
               <w:jc w:val="center"/>
               <w:rPr>
-                <w:rFonts w:ascii="Times New Roman" w:hAnsi="Times New Roman" w:cs="Times New Roman"/>
                 <w:sz w:val="26"/>
                 <w:szCs w:val="26"/>
               </w:rPr>
             </w:pPr>
             <w:r>
               <w:rPr>
-                <w:rFonts w:ascii="Times New Roman" w:hAnsi="Times New Roman" w:cs="Times New Roman"/>
                 <w:sz w:val="26"/>
                 <w:szCs w:val="26"/>
               </w:rPr>
@@ -20797,14 +20877,12 @@
           <w:p>
             <w:pPr>
               <w:rPr>
-                <w:rFonts w:ascii="Times New Roman" w:hAnsi="Times New Roman" w:cs="Times New Roman"/>
                 <w:sz w:val="26"/>
                 <w:szCs w:val="26"/>
               </w:rPr>
             </w:pPr>
             <w:r>
               <w:rPr>
-                <w:rFonts w:ascii="Times New Roman" w:hAnsi="Times New Roman" w:cs="Times New Roman"/>
                 <w:sz w:val="26"/>
                 <w:szCs w:val="26"/>
               </w:rPr>
@@ -20828,14 +20906,12 @@
               <w:ind w:right="96"/>
               <w:jc w:val="center"/>
               <w:rPr>
-                <w:rFonts w:ascii="Times New Roman" w:hAnsi="Times New Roman" w:cs="Times New Roman"/>
                 <w:sz w:val="26"/>
                 <w:szCs w:val="26"/>
               </w:rPr>
             </w:pPr>
             <w:r>
               <w:rPr>
-                <w:rFonts w:ascii="Times New Roman" w:hAnsi="Times New Roman" w:cs="Times New Roman"/>
                 <w:sz w:val="26"/>
                 <w:szCs w:val="26"/>
               </w:rPr>
@@ -20863,18 +20939,15 @@
               <w:ind w:right="98"/>
               <w:jc w:val="center"/>
               <w:rPr>
-                <w:rFonts w:ascii="Times New Roman" w:hAnsi="Times New Roman" w:cs="Times New Roman"/>
                 <w:sz w:val="26"/>
                 <w:szCs w:val="26"/>
               </w:rPr>
             </w:pPr>
             <w:r>
               <w:rPr>
-                <w:rFonts w:ascii="Times New Roman" w:hAnsi="Times New Roman" w:cs="Times New Roman"/>
                 <w:sz w:val="26"/>
                 <w:szCs w:val="26"/>
               </w:rPr>
-              <w:lastRenderedPageBreak/>
               <w:t xml:space="preserve">4 </w:t>
             </w:r>
           </w:p>
@@ -20892,14 +20965,12 @@
           <w:p>
             <w:pPr>
               <w:rPr>
-                <w:rFonts w:ascii="Times New Roman" w:hAnsi="Times New Roman" w:cs="Times New Roman"/>
                 <w:sz w:val="26"/>
                 <w:szCs w:val="26"/>
               </w:rPr>
             </w:pPr>
             <w:r>
               <w:rPr>
-                <w:rFonts w:ascii="Times New Roman" w:hAnsi="Times New Roman" w:cs="Times New Roman"/>
                 <w:sz w:val="26"/>
                 <w:szCs w:val="26"/>
               </w:rPr>
@@ -20923,14 +20994,12 @@
               <w:ind w:right="96"/>
               <w:jc w:val="center"/>
               <w:rPr>
-                <w:rFonts w:ascii="Times New Roman" w:hAnsi="Times New Roman" w:cs="Times New Roman"/>
                 <w:sz w:val="26"/>
                 <w:szCs w:val="26"/>
               </w:rPr>
             </w:pPr>
             <w:r>
               <w:rPr>
-                <w:rFonts w:ascii="Times New Roman" w:hAnsi="Times New Roman" w:cs="Times New Roman"/>
                 <w:sz w:val="26"/>
                 <w:szCs w:val="26"/>
               </w:rPr>
@@ -20958,14 +21027,12 @@
               <w:ind w:right="98"/>
               <w:jc w:val="center"/>
               <w:rPr>
-                <w:rFonts w:ascii="Times New Roman" w:hAnsi="Times New Roman" w:cs="Times New Roman"/>
                 <w:sz w:val="26"/>
                 <w:szCs w:val="26"/>
               </w:rPr>
             </w:pPr>
             <w:r>
               <w:rPr>
-                <w:rFonts w:ascii="Times New Roman" w:hAnsi="Times New Roman" w:cs="Times New Roman"/>
                 <w:sz w:val="26"/>
                 <w:szCs w:val="26"/>
               </w:rPr>
@@ -20986,14 +21053,12 @@
           <w:p>
             <w:pPr>
               <w:rPr>
-                <w:rFonts w:ascii="Times New Roman" w:hAnsi="Times New Roman" w:cs="Times New Roman"/>
                 <w:sz w:val="26"/>
                 <w:szCs w:val="26"/>
               </w:rPr>
             </w:pPr>
             <w:r>
               <w:rPr>
-                <w:rFonts w:ascii="Times New Roman" w:hAnsi="Times New Roman" w:cs="Times New Roman"/>
                 <w:sz w:val="26"/>
                 <w:szCs w:val="26"/>
               </w:rPr>
@@ -21017,14 +21082,12 @@
               <w:ind w:right="96"/>
               <w:jc w:val="center"/>
               <w:rPr>
-                <w:rFonts w:ascii="Times New Roman" w:hAnsi="Times New Roman" w:cs="Times New Roman"/>
                 <w:sz w:val="26"/>
                 <w:szCs w:val="26"/>
               </w:rPr>
             </w:pPr>
             <w:r>
               <w:rPr>
-                <w:rFonts w:ascii="Times New Roman" w:hAnsi="Times New Roman" w:cs="Times New Roman"/>
                 <w:sz w:val="26"/>
                 <w:szCs w:val="26"/>
               </w:rPr>
@@ -21052,14 +21115,12 @@
             <w:pPr>
               <w:jc w:val="right"/>
               <w:rPr>
-                <w:rFonts w:ascii="Times New Roman" w:hAnsi="Times New Roman" w:cs="Times New Roman"/>
                 <w:sz w:val="26"/>
                 <w:szCs w:val="26"/>
               </w:rPr>
             </w:pPr>
             <w:r>
               <w:rPr>
-                <w:rFonts w:ascii="Times New Roman" w:eastAsia="Times New Roman" w:hAnsi="Times New Roman" w:cs="Times New Roman"/>
                 <w:b/>
                 <w:sz w:val="26"/>
                 <w:szCs w:val="26"/>
@@ -21084,14 +21145,12 @@
               <w:ind w:left="466"/>
               <w:jc w:val="center"/>
               <w:rPr>
-                <w:rFonts w:ascii="Times New Roman" w:hAnsi="Times New Roman" w:cs="Times New Roman"/>
                 <w:sz w:val="26"/>
                 <w:szCs w:val="26"/>
               </w:rPr>
             </w:pPr>
             <w:r>
               <w:rPr>
-                <w:rFonts w:ascii="Times New Roman" w:eastAsia="Times New Roman" w:hAnsi="Times New Roman" w:cs="Times New Roman"/>
                 <w:b/>
                 <w:sz w:val="26"/>
                 <w:szCs w:val="26"/>
@@ -21103,14 +21162,12 @@
             <w:pPr>
               <w:ind w:left="1937"/>
               <w:rPr>
-                <w:rFonts w:ascii="Times New Roman" w:hAnsi="Times New Roman" w:cs="Times New Roman"/>
                 <w:sz w:val="26"/>
                 <w:szCs w:val="26"/>
               </w:rPr>
             </w:pPr>
             <w:r>
               <w:rPr>
-                <w:rFonts w:ascii="Times New Roman" w:eastAsia="Times New Roman" w:hAnsi="Times New Roman" w:cs="Times New Roman"/>
                 <w:i/>
                 <w:sz w:val="26"/>
                 <w:szCs w:val="26"/>
@@ -21134,7 +21191,6 @@
             <w:pPr>
               <w:ind w:left="218"/>
               <w:rPr>
-                <w:rFonts w:ascii="Times New Roman" w:hAnsi="Times New Roman" w:cs="Times New Roman"/>
                 <w:sz w:val="26"/>
                 <w:szCs w:val="26"/>
               </w:rPr>
@@ -21371,6 +21427,7 @@
           <w:noProof/>
           <w:sz w:val="22"/>
         </w:rPr>
+        <w:lastRenderedPageBreak/>
         <mc:AlternateContent>
           <mc:Choice Requires="wpg">
             <w:drawing>
@@ -21547,7 +21604,6 @@
     </w:p>
     <w:tbl>
       <w:tblPr>
-        <w:tblStyle w:val="TOCHeading"/>
         <w:tblW w:w="9518" w:type="dxa"/>
         <w:tblInd w:w="-108" w:type="dxa"/>
         <w:tblCellMar>
@@ -21580,16 +21636,11 @@
           <w:p>
             <w:pPr>
               <w:ind w:left="19"/>
-              <w:rPr>
-                <w:rFonts w:ascii="Times New Roman" w:hAnsi="Times New Roman" w:cs="Times New Roman"/>
-              </w:rPr>
             </w:pPr>
             <w:r>
               <w:rPr>
-                <w:rFonts w:ascii="Times New Roman" w:eastAsia="Times New Roman" w:hAnsi="Times New Roman" w:cs="Times New Roman"/>
                 <w:b/>
               </w:rPr>
-              <w:lastRenderedPageBreak/>
               <w:t xml:space="preserve">STT </w:t>
             </w:r>
           </w:p>
@@ -21609,13 +21660,9 @@
             <w:pPr>
               <w:ind w:right="99"/>
               <w:jc w:val="center"/>
-              <w:rPr>
-                <w:rFonts w:ascii="Times New Roman" w:hAnsi="Times New Roman" w:cs="Times New Roman"/>
-              </w:rPr>
             </w:pPr>
             <w:r>
               <w:rPr>
-                <w:rFonts w:ascii="Times New Roman" w:eastAsia="Times New Roman" w:hAnsi="Times New Roman" w:cs="Times New Roman"/>
                 <w:b/>
               </w:rPr>
               <w:t xml:space="preserve">Tiêu chí </w:t>
@@ -21638,13 +21685,9 @@
               <w:spacing w:after="73"/>
               <w:ind w:right="101"/>
               <w:jc w:val="center"/>
-              <w:rPr>
-                <w:rFonts w:ascii="Times New Roman" w:hAnsi="Times New Roman" w:cs="Times New Roman"/>
-              </w:rPr>
             </w:pPr>
             <w:r>
               <w:rPr>
-                <w:rFonts w:ascii="Times New Roman" w:eastAsia="Times New Roman" w:hAnsi="Times New Roman" w:cs="Times New Roman"/>
                 <w:b/>
               </w:rPr>
               <w:t xml:space="preserve">Điểm  </w:t>
@@ -21654,13 +21697,9 @@
             <w:pPr>
               <w:ind w:right="99"/>
               <w:jc w:val="center"/>
-              <w:rPr>
-                <w:rFonts w:ascii="Times New Roman" w:hAnsi="Times New Roman" w:cs="Times New Roman"/>
-              </w:rPr>
             </w:pPr>
             <w:r>
               <w:rPr>
-                <w:rFonts w:ascii="Times New Roman" w:eastAsia="Times New Roman" w:hAnsi="Times New Roman" w:cs="Times New Roman"/>
                 <w:b/>
               </w:rPr>
               <w:t xml:space="preserve">(tối đa) </w:t>
@@ -21687,13 +21726,9 @@
             <w:pPr>
               <w:ind w:right="98"/>
               <w:jc w:val="center"/>
-              <w:rPr>
-                <w:rFonts w:ascii="Times New Roman" w:hAnsi="Times New Roman" w:cs="Times New Roman"/>
-              </w:rPr>
             </w:pPr>
             <w:r>
               <w:rPr>
-                <w:rFonts w:ascii="Times New Roman" w:eastAsia="Times New Roman" w:hAnsi="Times New Roman" w:cs="Times New Roman"/>
                 <w:b/>
               </w:rPr>
               <w:t xml:space="preserve">I </w:t>
@@ -21712,14 +21747,8 @@
             <w:vAlign w:val="center"/>
           </w:tcPr>
           <w:p>
-            <w:pPr>
-              <w:rPr>
-                <w:rFonts w:ascii="Times New Roman" w:hAnsi="Times New Roman" w:cs="Times New Roman"/>
-              </w:rPr>
-            </w:pPr>
-            <w:r>
-              <w:rPr>
-                <w:rFonts w:ascii="Times New Roman" w:eastAsia="Times New Roman" w:hAnsi="Times New Roman" w:cs="Times New Roman"/>
+            <w:r>
+              <w:rPr>
                 <w:b/>
               </w:rPr>
               <w:t xml:space="preserve">Sáng kiến có tính mới  </w:t>
@@ -21739,14 +21768,10 @@
           <w:p>
             <w:pPr>
               <w:ind w:left="-9655" w:right="246"/>
-              <w:rPr>
-                <w:rFonts w:ascii="Times New Roman" w:hAnsi="Times New Roman" w:cs="Times New Roman"/>
-              </w:rPr>
             </w:pPr>
           </w:p>
           <w:tbl>
             <w:tblPr>
-              <w:tblStyle w:val="TOCHeading"/>
               <w:tblW w:w="803" w:type="dxa"/>
               <w:tblInd w:w="113" w:type="dxa"/>
               <w:tblCellMar>
@@ -21775,9 +21800,6 @@
                 <w:p>
                   <w:pPr>
                     <w:jc w:val="center"/>
-                    <w:rPr>
-                      <w:rFonts w:ascii="Times New Roman" w:hAnsi="Times New Roman" w:cs="Times New Roman"/>
-                    </w:rPr>
                   </w:pPr>
                 </w:p>
               </w:tc>
@@ -21786,9 +21808,6 @@
           <w:p>
             <w:pPr>
               <w:spacing w:after="160"/>
-              <w:rPr>
-                <w:rFonts w:ascii="Times New Roman" w:hAnsi="Times New Roman" w:cs="Times New Roman"/>
-              </w:rPr>
             </w:pPr>
           </w:p>
         </w:tc>
@@ -21811,14 +21830,8 @@
             <w:pPr>
               <w:ind w:right="98"/>
               <w:jc w:val="center"/>
-              <w:rPr>
-                <w:rFonts w:ascii="Times New Roman" w:hAnsi="Times New Roman" w:cs="Times New Roman"/>
-              </w:rPr>
             </w:pPr>
             <w:r>
-              <w:rPr>
-                <w:rFonts w:ascii="Times New Roman" w:hAnsi="Times New Roman" w:cs="Times New Roman"/>
-              </w:rPr>
               <w:t xml:space="preserve">1 </w:t>
             </w:r>
           </w:p>
@@ -21834,15 +21847,7 @@
             </w:tcBorders>
           </w:tcPr>
           <w:p>
-            <w:pPr>
-              <w:rPr>
-                <w:rFonts w:ascii="Times New Roman" w:hAnsi="Times New Roman" w:cs="Times New Roman"/>
-              </w:rPr>
-            </w:pPr>
-            <w:r>
-              <w:rPr>
-                <w:rFonts w:ascii="Times New Roman" w:hAnsi="Times New Roman" w:cs="Times New Roman"/>
-              </w:rPr>
+            <w:r>
               <w:t xml:space="preserve">Hoàn toàn mới, được áp dụng đầu tiên </w:t>
             </w:r>
           </w:p>
@@ -21861,14 +21866,8 @@
             <w:pPr>
               <w:ind w:right="96"/>
               <w:jc w:val="center"/>
-              <w:rPr>
-                <w:rFonts w:ascii="Times New Roman" w:hAnsi="Times New Roman" w:cs="Times New Roman"/>
-              </w:rPr>
             </w:pPr>
             <w:r>
-              <w:rPr>
-                <w:rFonts w:ascii="Times New Roman" w:hAnsi="Times New Roman" w:cs="Times New Roman"/>
-              </w:rPr>
               <w:t xml:space="preserve">40 </w:t>
             </w:r>
           </w:p>
@@ -21892,14 +21891,8 @@
             <w:pPr>
               <w:ind w:right="98"/>
               <w:jc w:val="center"/>
-              <w:rPr>
-                <w:rFonts w:ascii="Times New Roman" w:hAnsi="Times New Roman" w:cs="Times New Roman"/>
-              </w:rPr>
             </w:pPr>
             <w:r>
-              <w:rPr>
-                <w:rFonts w:ascii="Times New Roman" w:hAnsi="Times New Roman" w:cs="Times New Roman"/>
-              </w:rPr>
               <w:t xml:space="preserve">2 </w:t>
             </w:r>
           </w:p>
@@ -21916,15 +21909,7 @@
             <w:vAlign w:val="bottom"/>
           </w:tcPr>
           <w:p>
-            <w:pPr>
-              <w:rPr>
-                <w:rFonts w:ascii="Times New Roman" w:hAnsi="Times New Roman" w:cs="Times New Roman"/>
-              </w:rPr>
-            </w:pPr>
-            <w:r>
-              <w:rPr>
-                <w:rFonts w:ascii="Times New Roman" w:hAnsi="Times New Roman" w:cs="Times New Roman"/>
-              </w:rPr>
+            <w:r>
               <w:t xml:space="preserve">Có cải tiến so với giải pháp trước đây với mức độ khá </w:t>
             </w:r>
           </w:p>
@@ -21943,14 +21928,8 @@
             <w:pPr>
               <w:ind w:right="96"/>
               <w:jc w:val="center"/>
-              <w:rPr>
-                <w:rFonts w:ascii="Times New Roman" w:hAnsi="Times New Roman" w:cs="Times New Roman"/>
-              </w:rPr>
             </w:pPr>
             <w:r>
-              <w:rPr>
-                <w:rFonts w:ascii="Times New Roman" w:hAnsi="Times New Roman" w:cs="Times New Roman"/>
-              </w:rPr>
               <w:t xml:space="preserve">35 </w:t>
             </w:r>
           </w:p>
@@ -21974,14 +21953,8 @@
             <w:pPr>
               <w:ind w:right="98"/>
               <w:jc w:val="center"/>
-              <w:rPr>
-                <w:rFonts w:ascii="Times New Roman" w:hAnsi="Times New Roman" w:cs="Times New Roman"/>
-              </w:rPr>
             </w:pPr>
             <w:r>
-              <w:rPr>
-                <w:rFonts w:ascii="Times New Roman" w:hAnsi="Times New Roman" w:cs="Times New Roman"/>
-              </w:rPr>
               <w:t xml:space="preserve">3 </w:t>
             </w:r>
           </w:p>
@@ -21997,15 +21970,7 @@
             </w:tcBorders>
           </w:tcPr>
           <w:p>
-            <w:pPr>
-              <w:rPr>
-                <w:rFonts w:ascii="Times New Roman" w:hAnsi="Times New Roman" w:cs="Times New Roman"/>
-              </w:rPr>
-            </w:pPr>
-            <w:r>
-              <w:rPr>
-                <w:rFonts w:ascii="Times New Roman" w:hAnsi="Times New Roman" w:cs="Times New Roman"/>
-              </w:rPr>
+            <w:r>
               <w:t xml:space="preserve">Có cải tiến so với giải pháp trước đây với mức độ trung bình khá </w:t>
             </w:r>
           </w:p>
@@ -22024,14 +21989,8 @@
             <w:pPr>
               <w:ind w:right="96"/>
               <w:jc w:val="center"/>
-              <w:rPr>
-                <w:rFonts w:ascii="Times New Roman" w:hAnsi="Times New Roman" w:cs="Times New Roman"/>
-              </w:rPr>
             </w:pPr>
             <w:r>
-              <w:rPr>
-                <w:rFonts w:ascii="Times New Roman" w:hAnsi="Times New Roman" w:cs="Times New Roman"/>
-              </w:rPr>
               <w:t xml:space="preserve">29 </w:t>
             </w:r>
           </w:p>
@@ -22055,14 +22014,8 @@
             <w:pPr>
               <w:ind w:right="98"/>
               <w:jc w:val="center"/>
-              <w:rPr>
-                <w:rFonts w:ascii="Times New Roman" w:hAnsi="Times New Roman" w:cs="Times New Roman"/>
-              </w:rPr>
             </w:pPr>
             <w:r>
-              <w:rPr>
-                <w:rFonts w:ascii="Times New Roman" w:hAnsi="Times New Roman" w:cs="Times New Roman"/>
-              </w:rPr>
               <w:t xml:space="preserve">4 </w:t>
             </w:r>
           </w:p>
@@ -22078,15 +22031,7 @@
             </w:tcBorders>
           </w:tcPr>
           <w:p>
-            <w:pPr>
-              <w:rPr>
-                <w:rFonts w:ascii="Times New Roman" w:hAnsi="Times New Roman" w:cs="Times New Roman"/>
-              </w:rPr>
-            </w:pPr>
-            <w:r>
-              <w:rPr>
-                <w:rFonts w:ascii="Times New Roman" w:hAnsi="Times New Roman" w:cs="Times New Roman"/>
-              </w:rPr>
+            <w:r>
               <w:t xml:space="preserve">Có cải tiến so với giải pháp trước đây với mức độ trung bình </w:t>
             </w:r>
           </w:p>
@@ -22105,14 +22050,8 @@
             <w:pPr>
               <w:ind w:right="96"/>
               <w:jc w:val="center"/>
-              <w:rPr>
-                <w:rFonts w:ascii="Times New Roman" w:hAnsi="Times New Roman" w:cs="Times New Roman"/>
-              </w:rPr>
             </w:pPr>
             <w:r>
-              <w:rPr>
-                <w:rFonts w:ascii="Times New Roman" w:hAnsi="Times New Roman" w:cs="Times New Roman"/>
-              </w:rPr>
               <w:t xml:space="preserve">20  </w:t>
             </w:r>
           </w:p>
@@ -22136,14 +22075,8 @@
             <w:pPr>
               <w:ind w:right="98"/>
               <w:jc w:val="center"/>
-              <w:rPr>
-                <w:rFonts w:ascii="Times New Roman" w:hAnsi="Times New Roman" w:cs="Times New Roman"/>
-              </w:rPr>
             </w:pPr>
             <w:r>
-              <w:rPr>
-                <w:rFonts w:ascii="Times New Roman" w:hAnsi="Times New Roman" w:cs="Times New Roman"/>
-              </w:rPr>
               <w:t xml:space="preserve">5 </w:t>
             </w:r>
           </w:p>
@@ -22160,15 +22093,7 @@
             <w:vAlign w:val="bottom"/>
           </w:tcPr>
           <w:p>
-            <w:pPr>
-              <w:rPr>
-                <w:rFonts w:ascii="Times New Roman" w:hAnsi="Times New Roman" w:cs="Times New Roman"/>
-              </w:rPr>
-            </w:pPr>
-            <w:r>
-              <w:rPr>
-                <w:rFonts w:ascii="Times New Roman" w:hAnsi="Times New Roman" w:cs="Times New Roman"/>
-              </w:rPr>
+            <w:r>
               <w:t xml:space="preserve">Có cải tiến so với giải pháp trước đây với mức độ ít hơn trung bình </w:t>
             </w:r>
           </w:p>
@@ -22187,14 +22112,8 @@
             <w:pPr>
               <w:ind w:right="96"/>
               <w:jc w:val="center"/>
-              <w:rPr>
-                <w:rFonts w:ascii="Times New Roman" w:hAnsi="Times New Roman" w:cs="Times New Roman"/>
-              </w:rPr>
             </w:pPr>
             <w:r>
-              <w:rPr>
-                <w:rFonts w:ascii="Times New Roman" w:hAnsi="Times New Roman" w:cs="Times New Roman"/>
-              </w:rPr>
               <w:t xml:space="preserve">15 </w:t>
             </w:r>
           </w:p>
@@ -22218,14 +22137,8 @@
             <w:pPr>
               <w:ind w:right="98"/>
               <w:jc w:val="center"/>
-              <w:rPr>
-                <w:rFonts w:ascii="Times New Roman" w:hAnsi="Times New Roman" w:cs="Times New Roman"/>
-              </w:rPr>
             </w:pPr>
             <w:r>
-              <w:rPr>
-                <w:rFonts w:ascii="Times New Roman" w:hAnsi="Times New Roman" w:cs="Times New Roman"/>
-              </w:rPr>
               <w:t xml:space="preserve">6 </w:t>
             </w:r>
           </w:p>
@@ -22241,15 +22154,7 @@
             </w:tcBorders>
           </w:tcPr>
           <w:p>
-            <w:pPr>
-              <w:rPr>
-                <w:rFonts w:ascii="Times New Roman" w:hAnsi="Times New Roman" w:cs="Times New Roman"/>
-              </w:rPr>
-            </w:pPr>
-            <w:r>
-              <w:rPr>
-                <w:rFonts w:ascii="Times New Roman" w:hAnsi="Times New Roman" w:cs="Times New Roman"/>
-              </w:rPr>
+            <w:r>
               <w:t xml:space="preserve">Không có yếu tố mới hoặc sao chép từ các giải pháp đã có trước đây </w:t>
             </w:r>
           </w:p>
@@ -22268,14 +22173,8 @@
             <w:pPr>
               <w:ind w:right="96"/>
               <w:jc w:val="center"/>
-              <w:rPr>
-                <w:rFonts w:ascii="Times New Roman" w:hAnsi="Times New Roman" w:cs="Times New Roman"/>
-              </w:rPr>
             </w:pPr>
             <w:r>
-              <w:rPr>
-                <w:rFonts w:ascii="Times New Roman" w:hAnsi="Times New Roman" w:cs="Times New Roman"/>
-              </w:rPr>
               <w:t xml:space="preserve">9 </w:t>
             </w:r>
           </w:p>
@@ -22300,13 +22199,9 @@
             <w:pPr>
               <w:ind w:right="98"/>
               <w:jc w:val="center"/>
-              <w:rPr>
-                <w:rFonts w:ascii="Times New Roman" w:hAnsi="Times New Roman" w:cs="Times New Roman"/>
-              </w:rPr>
             </w:pPr>
             <w:r>
               <w:rPr>
-                <w:rFonts w:ascii="Times New Roman" w:eastAsia="Times New Roman" w:hAnsi="Times New Roman" w:cs="Times New Roman"/>
                 <w:b/>
               </w:rPr>
               <w:t xml:space="preserve">II </w:t>
@@ -22325,14 +22220,8 @@
             <w:vAlign w:val="bottom"/>
           </w:tcPr>
           <w:p>
-            <w:pPr>
-              <w:rPr>
-                <w:rFonts w:ascii="Times New Roman" w:hAnsi="Times New Roman" w:cs="Times New Roman"/>
-              </w:rPr>
-            </w:pPr>
-            <w:r>
-              <w:rPr>
-                <w:rFonts w:ascii="Times New Roman" w:eastAsia="Times New Roman" w:hAnsi="Times New Roman" w:cs="Times New Roman"/>
+            <w:r>
+              <w:rPr>
                 <w:b/>
               </w:rPr>
               <w:t xml:space="preserve">Sáng kiến có khả năng áp dụng  </w:t>
@@ -22351,7 +22240,6 @@
           </w:tcPr>
           <w:tbl>
             <w:tblPr>
-              <w:tblStyle w:val="TOCHeading"/>
               <w:tblW w:w="720" w:type="dxa"/>
               <w:tblInd w:w="164" w:type="dxa"/>
               <w:tblCellMar>
@@ -22381,14 +22269,8 @@
                   <w:pPr>
                     <w:ind w:left="82"/>
                     <w:jc w:val="center"/>
-                    <w:rPr>
-                      <w:rFonts w:ascii="Times New Roman" w:hAnsi="Times New Roman" w:cs="Times New Roman"/>
-                    </w:rPr>
                   </w:pPr>
                   <w:r>
-                    <w:rPr>
-                      <w:rFonts w:ascii="Times New Roman" w:hAnsi="Times New Roman" w:cs="Times New Roman"/>
-                    </w:rPr>
                     <w:t xml:space="preserve"> </w:t>
                   </w:r>
                 </w:p>
@@ -22398,9 +22280,6 @@
           <w:p>
             <w:pPr>
               <w:spacing w:after="160"/>
-              <w:rPr>
-                <w:rFonts w:ascii="Times New Roman" w:hAnsi="Times New Roman" w:cs="Times New Roman"/>
-              </w:rPr>
             </w:pPr>
           </w:p>
         </w:tc>
@@ -22423,14 +22302,8 @@
             <w:pPr>
               <w:ind w:right="98"/>
               <w:jc w:val="center"/>
-              <w:rPr>
-                <w:rFonts w:ascii="Times New Roman" w:hAnsi="Times New Roman" w:cs="Times New Roman"/>
-              </w:rPr>
             </w:pPr>
             <w:r>
-              <w:rPr>
-                <w:rFonts w:ascii="Times New Roman" w:hAnsi="Times New Roman" w:cs="Times New Roman"/>
-              </w:rPr>
               <w:t xml:space="preserve">1 </w:t>
             </w:r>
           </w:p>
@@ -22446,15 +22319,7 @@
             </w:tcBorders>
           </w:tcPr>
           <w:p>
-            <w:pPr>
-              <w:rPr>
-                <w:rFonts w:ascii="Times New Roman" w:hAnsi="Times New Roman" w:cs="Times New Roman"/>
-              </w:rPr>
-            </w:pPr>
-            <w:r>
-              <w:rPr>
-                <w:rFonts w:ascii="Times New Roman" w:hAnsi="Times New Roman" w:cs="Times New Roman"/>
-              </w:rPr>
+            <w:r>
               <w:t xml:space="preserve">Có khả năng áp dụng trong toàn tỉnh hoặc ngoài tỉnh </w:t>
             </w:r>
           </w:p>
@@ -22473,14 +22338,8 @@
             <w:pPr>
               <w:ind w:right="96"/>
               <w:jc w:val="center"/>
-              <w:rPr>
-                <w:rFonts w:ascii="Times New Roman" w:hAnsi="Times New Roman" w:cs="Times New Roman"/>
-              </w:rPr>
             </w:pPr>
             <w:r>
-              <w:rPr>
-                <w:rFonts w:ascii="Times New Roman" w:hAnsi="Times New Roman" w:cs="Times New Roman"/>
-              </w:rPr>
               <w:t xml:space="preserve">20 </w:t>
             </w:r>
           </w:p>
@@ -22505,14 +22364,8 @@
             <w:pPr>
               <w:ind w:right="98"/>
               <w:jc w:val="center"/>
-              <w:rPr>
-                <w:rFonts w:ascii="Times New Roman" w:hAnsi="Times New Roman" w:cs="Times New Roman"/>
-              </w:rPr>
             </w:pPr>
             <w:r>
-              <w:rPr>
-                <w:rFonts w:ascii="Times New Roman" w:hAnsi="Times New Roman" w:cs="Times New Roman"/>
-              </w:rPr>
               <w:t xml:space="preserve">2 </w:t>
             </w:r>
           </w:p>
@@ -22529,15 +22382,7 @@
             <w:vAlign w:val="bottom"/>
           </w:tcPr>
           <w:p>
-            <w:pPr>
-              <w:rPr>
-                <w:rFonts w:ascii="Times New Roman" w:hAnsi="Times New Roman" w:cs="Times New Roman"/>
-              </w:rPr>
-            </w:pPr>
-            <w:r>
-              <w:rPr>
-                <w:rFonts w:ascii="Times New Roman" w:hAnsi="Times New Roman" w:cs="Times New Roman"/>
-              </w:rPr>
+            <w:r>
               <w:t xml:space="preserve">Có khả năng áp dụng trong đơn vị và có thể nhân ra ở một số đơn vị trong tỉnh </w:t>
             </w:r>
           </w:p>
@@ -22557,14 +22402,8 @@
             <w:pPr>
               <w:ind w:right="96"/>
               <w:jc w:val="center"/>
-              <w:rPr>
-                <w:rFonts w:ascii="Times New Roman" w:hAnsi="Times New Roman" w:cs="Times New Roman"/>
-              </w:rPr>
             </w:pPr>
             <w:r>
-              <w:rPr>
-                <w:rFonts w:ascii="Times New Roman" w:hAnsi="Times New Roman" w:cs="Times New Roman"/>
-              </w:rPr>
               <w:t xml:space="preserve">15 </w:t>
             </w:r>
           </w:p>
@@ -22588,14 +22427,8 @@
             <w:pPr>
               <w:ind w:right="98"/>
               <w:jc w:val="center"/>
-              <w:rPr>
-                <w:rFonts w:ascii="Times New Roman" w:hAnsi="Times New Roman" w:cs="Times New Roman"/>
-              </w:rPr>
             </w:pPr>
             <w:r>
-              <w:rPr>
-                <w:rFonts w:ascii="Times New Roman" w:hAnsi="Times New Roman" w:cs="Times New Roman"/>
-              </w:rPr>
               <w:t xml:space="preserve">3 </w:t>
             </w:r>
           </w:p>
@@ -22612,15 +22445,7 @@
             <w:vAlign w:val="bottom"/>
           </w:tcPr>
           <w:p>
-            <w:pPr>
-              <w:rPr>
-                <w:rFonts w:ascii="Times New Roman" w:hAnsi="Times New Roman" w:cs="Times New Roman"/>
-              </w:rPr>
-            </w:pPr>
-            <w:r>
-              <w:rPr>
-                <w:rFonts w:ascii="Times New Roman" w:hAnsi="Times New Roman" w:cs="Times New Roman"/>
-              </w:rPr>
+            <w:r>
               <w:t xml:space="preserve">Có khả năng áp dụng ít trong đơn vị </w:t>
             </w:r>
           </w:p>
@@ -22639,14 +22464,8 @@
             <w:pPr>
               <w:ind w:right="96"/>
               <w:jc w:val="center"/>
-              <w:rPr>
-                <w:rFonts w:ascii="Times New Roman" w:hAnsi="Times New Roman" w:cs="Times New Roman"/>
-              </w:rPr>
             </w:pPr>
             <w:r>
-              <w:rPr>
-                <w:rFonts w:ascii="Times New Roman" w:hAnsi="Times New Roman" w:cs="Times New Roman"/>
-              </w:rPr>
               <w:t xml:space="preserve">5 </w:t>
             </w:r>
           </w:p>
@@ -22670,14 +22489,8 @@
             <w:pPr>
               <w:ind w:right="98"/>
               <w:jc w:val="center"/>
-              <w:rPr>
-                <w:rFonts w:ascii="Times New Roman" w:hAnsi="Times New Roman" w:cs="Times New Roman"/>
-              </w:rPr>
             </w:pPr>
             <w:r>
-              <w:rPr>
-                <w:rFonts w:ascii="Times New Roman" w:hAnsi="Times New Roman" w:cs="Times New Roman"/>
-              </w:rPr>
               <w:t xml:space="preserve">4 </w:t>
             </w:r>
           </w:p>
@@ -22694,15 +22507,7 @@
             <w:vAlign w:val="bottom"/>
           </w:tcPr>
           <w:p>
-            <w:pPr>
-              <w:rPr>
-                <w:rFonts w:ascii="Times New Roman" w:hAnsi="Times New Roman" w:cs="Times New Roman"/>
-              </w:rPr>
-            </w:pPr>
-            <w:r>
-              <w:rPr>
-                <w:rFonts w:ascii="Times New Roman" w:hAnsi="Times New Roman" w:cs="Times New Roman"/>
-              </w:rPr>
+            <w:r>
               <w:t xml:space="preserve">Không khả năng áp dụng trong đơn vị </w:t>
             </w:r>
           </w:p>
@@ -22721,14 +22526,8 @@
             <w:pPr>
               <w:ind w:right="96"/>
               <w:jc w:val="center"/>
-              <w:rPr>
-                <w:rFonts w:ascii="Times New Roman" w:hAnsi="Times New Roman" w:cs="Times New Roman"/>
-              </w:rPr>
             </w:pPr>
             <w:r>
-              <w:rPr>
-                <w:rFonts w:ascii="Times New Roman" w:hAnsi="Times New Roman" w:cs="Times New Roman"/>
-              </w:rPr>
               <w:t xml:space="preserve">0 </w:t>
             </w:r>
           </w:p>
@@ -22752,13 +22551,9 @@
             <w:pPr>
               <w:ind w:right="98"/>
               <w:jc w:val="center"/>
-              <w:rPr>
-                <w:rFonts w:ascii="Times New Roman" w:hAnsi="Times New Roman" w:cs="Times New Roman"/>
-              </w:rPr>
             </w:pPr>
             <w:r>
               <w:rPr>
-                <w:rFonts w:ascii="Times New Roman" w:eastAsia="Times New Roman" w:hAnsi="Times New Roman" w:cs="Times New Roman"/>
                 <w:b/>
               </w:rPr>
               <w:t xml:space="preserve">III </w:t>
@@ -22776,14 +22571,8 @@
             </w:tcBorders>
           </w:tcPr>
           <w:p>
-            <w:pPr>
-              <w:rPr>
-                <w:rFonts w:ascii="Times New Roman" w:hAnsi="Times New Roman" w:cs="Times New Roman"/>
-              </w:rPr>
-            </w:pPr>
-            <w:r>
-              <w:rPr>
-                <w:rFonts w:ascii="Times New Roman" w:eastAsia="Times New Roman" w:hAnsi="Times New Roman" w:cs="Times New Roman"/>
+            <w:r>
+              <w:rPr>
                 <w:b/>
               </w:rPr>
               <w:t xml:space="preserve">Sáng kiến có khả năng mang lại hiệu quả thiết thực  </w:t>
@@ -22802,7 +22591,6 @@
           </w:tcPr>
           <w:tbl>
             <w:tblPr>
-              <w:tblStyle w:val="TOCHeading"/>
               <w:tblW w:w="720" w:type="dxa"/>
               <w:tblInd w:w="154" w:type="dxa"/>
               <w:tblCellMar>
@@ -22832,14 +22620,8 @@
                   <w:pPr>
                     <w:ind w:left="102"/>
                     <w:jc w:val="center"/>
-                    <w:rPr>
-                      <w:rFonts w:ascii="Times New Roman" w:hAnsi="Times New Roman" w:cs="Times New Roman"/>
-                    </w:rPr>
                   </w:pPr>
                   <w:r>
-                    <w:rPr>
-                      <w:rFonts w:ascii="Times New Roman" w:hAnsi="Times New Roman" w:cs="Times New Roman"/>
-                    </w:rPr>
                     <w:t xml:space="preserve"> </w:t>
                   </w:r>
                 </w:p>
@@ -22849,9 +22631,6 @@
           <w:p>
             <w:pPr>
               <w:spacing w:after="160"/>
-              <w:rPr>
-                <w:rFonts w:ascii="Times New Roman" w:hAnsi="Times New Roman" w:cs="Times New Roman"/>
-              </w:rPr>
             </w:pPr>
           </w:p>
         </w:tc>
@@ -22874,14 +22653,8 @@
             <w:pPr>
               <w:ind w:right="98"/>
               <w:jc w:val="center"/>
-              <w:rPr>
-                <w:rFonts w:ascii="Times New Roman" w:hAnsi="Times New Roman" w:cs="Times New Roman"/>
-              </w:rPr>
             </w:pPr>
             <w:r>
-              <w:rPr>
-                <w:rFonts w:ascii="Times New Roman" w:hAnsi="Times New Roman" w:cs="Times New Roman"/>
-              </w:rPr>
               <w:t xml:space="preserve">1 </w:t>
             </w:r>
           </w:p>
@@ -22897,15 +22670,7 @@
             </w:tcBorders>
           </w:tcPr>
           <w:p>
-            <w:pPr>
-              <w:rPr>
-                <w:rFonts w:ascii="Times New Roman" w:hAnsi="Times New Roman" w:cs="Times New Roman"/>
-              </w:rPr>
-            </w:pPr>
-            <w:r>
-              <w:rPr>
-                <w:rFonts w:ascii="Times New Roman" w:hAnsi="Times New Roman" w:cs="Times New Roman"/>
-              </w:rPr>
+            <w:r>
               <w:t xml:space="preserve">Có hiệu quả kinh tế hoặc lợi ích xã hội với mức độ tốt </w:t>
             </w:r>
           </w:p>
@@ -22924,14 +22689,8 @@
             <w:pPr>
               <w:ind w:right="96"/>
               <w:jc w:val="center"/>
-              <w:rPr>
-                <w:rFonts w:ascii="Times New Roman" w:hAnsi="Times New Roman" w:cs="Times New Roman"/>
-              </w:rPr>
             </w:pPr>
             <w:r>
-              <w:rPr>
-                <w:rFonts w:ascii="Times New Roman" w:hAnsi="Times New Roman" w:cs="Times New Roman"/>
-              </w:rPr>
               <w:t xml:space="preserve">40 </w:t>
             </w:r>
           </w:p>
@@ -22955,14 +22714,8 @@
             <w:pPr>
               <w:ind w:right="98"/>
               <w:jc w:val="center"/>
-              <w:rPr>
-                <w:rFonts w:ascii="Times New Roman" w:hAnsi="Times New Roman" w:cs="Times New Roman"/>
-              </w:rPr>
             </w:pPr>
             <w:r>
-              <w:rPr>
-                <w:rFonts w:ascii="Times New Roman" w:hAnsi="Times New Roman" w:cs="Times New Roman"/>
-              </w:rPr>
               <w:t xml:space="preserve">2 </w:t>
             </w:r>
           </w:p>
@@ -22978,15 +22731,7 @@
             </w:tcBorders>
           </w:tcPr>
           <w:p>
-            <w:pPr>
-              <w:rPr>
-                <w:rFonts w:ascii="Times New Roman" w:hAnsi="Times New Roman" w:cs="Times New Roman"/>
-              </w:rPr>
-            </w:pPr>
-            <w:r>
-              <w:rPr>
-                <w:rFonts w:ascii="Times New Roman" w:hAnsi="Times New Roman" w:cs="Times New Roman"/>
-              </w:rPr>
+            <w:r>
               <w:t xml:space="preserve">Có hiệu quả kinh tế hoặc lợi ích xã hội với mức độ khá </w:t>
             </w:r>
           </w:p>
@@ -23005,14 +22750,8 @@
             <w:pPr>
               <w:ind w:right="96"/>
               <w:jc w:val="center"/>
-              <w:rPr>
-                <w:rFonts w:ascii="Times New Roman" w:hAnsi="Times New Roman" w:cs="Times New Roman"/>
-              </w:rPr>
             </w:pPr>
             <w:r>
-              <w:rPr>
-                <w:rFonts w:ascii="Times New Roman" w:hAnsi="Times New Roman" w:cs="Times New Roman"/>
-              </w:rPr>
               <w:t xml:space="preserve">30 </w:t>
             </w:r>
           </w:p>
@@ -23036,14 +22775,8 @@
             <w:pPr>
               <w:ind w:right="98"/>
               <w:jc w:val="center"/>
-              <w:rPr>
-                <w:rFonts w:ascii="Times New Roman" w:hAnsi="Times New Roman" w:cs="Times New Roman"/>
-              </w:rPr>
             </w:pPr>
             <w:r>
-              <w:rPr>
-                <w:rFonts w:ascii="Times New Roman" w:hAnsi="Times New Roman" w:cs="Times New Roman"/>
-              </w:rPr>
               <w:t xml:space="preserve">3 </w:t>
             </w:r>
           </w:p>
@@ -23059,15 +22792,7 @@
             </w:tcBorders>
           </w:tcPr>
           <w:p>
-            <w:pPr>
-              <w:rPr>
-                <w:rFonts w:ascii="Times New Roman" w:hAnsi="Times New Roman" w:cs="Times New Roman"/>
-              </w:rPr>
-            </w:pPr>
-            <w:r>
-              <w:rPr>
-                <w:rFonts w:ascii="Times New Roman" w:hAnsi="Times New Roman" w:cs="Times New Roman"/>
-              </w:rPr>
+            <w:r>
               <w:t xml:space="preserve">Có hiệu quả kinh tế hoặc lợi ích xã hội với mức độ trung bình </w:t>
             </w:r>
           </w:p>
@@ -23086,14 +22811,8 @@
             <w:pPr>
               <w:ind w:right="96"/>
               <w:jc w:val="center"/>
-              <w:rPr>
-                <w:rFonts w:ascii="Times New Roman" w:hAnsi="Times New Roman" w:cs="Times New Roman"/>
-              </w:rPr>
             </w:pPr>
             <w:r>
-              <w:rPr>
-                <w:rFonts w:ascii="Times New Roman" w:hAnsi="Times New Roman" w:cs="Times New Roman"/>
-              </w:rPr>
               <w:t xml:space="preserve">20 </w:t>
             </w:r>
           </w:p>
@@ -23117,14 +22836,8 @@
             <w:pPr>
               <w:ind w:right="98"/>
               <w:jc w:val="center"/>
-              <w:rPr>
-                <w:rFonts w:ascii="Times New Roman" w:hAnsi="Times New Roman" w:cs="Times New Roman"/>
-              </w:rPr>
             </w:pPr>
             <w:r>
-              <w:rPr>
-                <w:rFonts w:ascii="Times New Roman" w:hAnsi="Times New Roman" w:cs="Times New Roman"/>
-              </w:rPr>
               <w:t xml:space="preserve">4 </w:t>
             </w:r>
           </w:p>
@@ -23140,15 +22853,7 @@
             </w:tcBorders>
           </w:tcPr>
           <w:p>
-            <w:pPr>
-              <w:rPr>
-                <w:rFonts w:ascii="Times New Roman" w:hAnsi="Times New Roman" w:cs="Times New Roman"/>
-              </w:rPr>
-            </w:pPr>
-            <w:r>
-              <w:rPr>
-                <w:rFonts w:ascii="Times New Roman" w:hAnsi="Times New Roman" w:cs="Times New Roman"/>
-              </w:rPr>
+            <w:r>
               <w:t xml:space="preserve">Có hiệu quả kinh tế hoặc lợi ích xã hội với mức độ ít hơn trung bình  </w:t>
             </w:r>
           </w:p>
@@ -23167,14 +22872,8 @@
             <w:pPr>
               <w:ind w:right="96"/>
               <w:jc w:val="center"/>
-              <w:rPr>
-                <w:rFonts w:ascii="Times New Roman" w:hAnsi="Times New Roman" w:cs="Times New Roman"/>
-              </w:rPr>
             </w:pPr>
             <w:r>
-              <w:rPr>
-                <w:rFonts w:ascii="Times New Roman" w:hAnsi="Times New Roman" w:cs="Times New Roman"/>
-              </w:rPr>
               <w:t xml:space="preserve">10 </w:t>
             </w:r>
           </w:p>
@@ -23198,15 +22897,8 @@
             <w:pPr>
               <w:ind w:right="98"/>
               <w:jc w:val="center"/>
-              <w:rPr>
-                <w:rFonts w:ascii="Times New Roman" w:hAnsi="Times New Roman" w:cs="Times New Roman"/>
-              </w:rPr>
             </w:pPr>
             <w:r>
-              <w:rPr>
-                <w:rFonts w:ascii="Times New Roman" w:hAnsi="Times New Roman" w:cs="Times New Roman"/>
-              </w:rPr>
-              <w:lastRenderedPageBreak/>
               <w:t xml:space="preserve">5 </w:t>
             </w:r>
           </w:p>
@@ -23222,15 +22914,7 @@
             </w:tcBorders>
           </w:tcPr>
           <w:p>
-            <w:pPr>
-              <w:rPr>
-                <w:rFonts w:ascii="Times New Roman" w:hAnsi="Times New Roman" w:cs="Times New Roman"/>
-              </w:rPr>
-            </w:pPr>
-            <w:r>
-              <w:rPr>
-                <w:rFonts w:ascii="Times New Roman" w:hAnsi="Times New Roman" w:cs="Times New Roman"/>
-              </w:rPr>
+            <w:r>
               <w:t xml:space="preserve">Không có hiệu quả kinh tế hoặc lợi ích xã hội  </w:t>
             </w:r>
           </w:p>
@@ -23249,14 +22933,8 @@
             <w:pPr>
               <w:ind w:right="96"/>
               <w:jc w:val="center"/>
-              <w:rPr>
-                <w:rFonts w:ascii="Times New Roman" w:hAnsi="Times New Roman" w:cs="Times New Roman"/>
-              </w:rPr>
             </w:pPr>
             <w:r>
-              <w:rPr>
-                <w:rFonts w:ascii="Times New Roman" w:hAnsi="Times New Roman" w:cs="Times New Roman"/>
-              </w:rPr>
               <w:t xml:space="preserve">0 </w:t>
             </w:r>
           </w:p>
@@ -23280,13 +22958,9 @@
           <w:p>
             <w:pPr>
               <w:jc w:val="right"/>
-              <w:rPr>
-                <w:rFonts w:ascii="Times New Roman" w:hAnsi="Times New Roman" w:cs="Times New Roman"/>
-              </w:rPr>
             </w:pPr>
             <w:r>
               <w:rPr>
-                <w:rFonts w:ascii="Times New Roman" w:eastAsia="Times New Roman" w:hAnsi="Times New Roman" w:cs="Times New Roman"/>
                 <w:b/>
               </w:rPr>
               <w:t xml:space="preserve"> </w:t>
@@ -23308,13 +22982,9 @@
               <w:spacing w:after="47"/>
               <w:ind w:right="101"/>
               <w:jc w:val="center"/>
-              <w:rPr>
-                <w:rFonts w:ascii="Times New Roman" w:hAnsi="Times New Roman" w:cs="Times New Roman"/>
-              </w:rPr>
             </w:pPr>
             <w:r>
               <w:rPr>
-                <w:rFonts w:ascii="Times New Roman" w:eastAsia="Times New Roman" w:hAnsi="Times New Roman" w:cs="Times New Roman"/>
                 <w:b/>
               </w:rPr>
               <w:t xml:space="preserve">Tổng cộng </w:t>
@@ -23324,13 +22994,9 @@
             <w:pPr>
               <w:ind w:right="101"/>
               <w:jc w:val="center"/>
-              <w:rPr>
-                <w:rFonts w:ascii="Times New Roman" w:hAnsi="Times New Roman" w:cs="Times New Roman"/>
-              </w:rPr>
             </w:pPr>
             <w:r>
               <w:rPr>
-                <w:rFonts w:ascii="Times New Roman" w:eastAsia="Times New Roman" w:hAnsi="Times New Roman" w:cs="Times New Roman"/>
                 <w:i/>
               </w:rPr>
               <w:t xml:space="preserve">(là điểm cộng của 03 mục: I, II và III) </w:t>
@@ -23350,9 +23016,6 @@
           <w:p>
             <w:pPr>
               <w:ind w:left="149"/>
-              <w:rPr>
-                <w:rFonts w:ascii="Times New Roman" w:hAnsi="Times New Roman" w:cs="Times New Roman"/>
-              </w:rPr>
             </w:pPr>
             <w:r>
               <w:rPr>
@@ -23520,8 +23183,8 @@
       </w:r>
     </w:p>
     <w:sectPr>
-      <w:headerReference w:type="default" r:id="rId31"/>
-      <w:footerReference w:type="default" r:id="rId32"/>
+      <w:headerReference w:type="default" r:id="rId32"/>
+      <w:footerReference w:type="default" r:id="rId33"/>
       <w:pgSz w:w="12240" w:h="15840"/>
       <w:pgMar w:top="1418" w:right="1134" w:bottom="1418" w:left="1701" w:header="720" w:footer="720" w:gutter="0"/>
       <w:pgNumType w:start="1"/>
@@ -31791,6 +31454,7 @@
   <w:style w:type="character" w:default="1" w:styleId="DefaultParagraphFont">
     <w:name w:val="Default Paragraph Font"/>
     <w:uiPriority w:val="1"/>
+    <w:semiHidden/>
     <w:unhideWhenUsed/>
   </w:style>
   <w:style w:type="table" w:default="1" w:styleId="TableNormal">

</xml_diff>